<commit_message>
Add Quarantine Zone Mobile case + mobile mesh-optimization bullet
- New project card between Mega Ramp and Obby Island
- New Aviana CV bullet for mobile geometry optimization (~1M -> ~40k tris)
- Sync downloadable docx with site CV
</commit_message>
<xml_diff>
--- a/Iusup_Abduliaparov_CV_Simulation_v2_ATS.docx
+++ b/Iusup_Abduliaparov_CV_Simulation_v2_ATS.docx
@@ -1,13 +1,64 @@
 
-<file path=word/document.xml><?xml version="1.0" encoding="utf-8"?>
+<file path=docProps\app.xml><?xml version="1.0" encoding="utf-8"?>
+<Properties xmlns="http://schemas.openxmlformats.org/officeDocument/2006/extended-properties" xmlns:vt="http://schemas.openxmlformats.org/officeDocument/2006/docPropsVTypes">
+  <Template>Normal.dotm</Template>
+  <TotalTime>49</TotalTime>
+  <Pages>1</Pages>
+  <Words>659</Words>
+  <Characters>3757</Characters>
+  <Application>Microsoft Office Word</Application>
+  <DocSecurity>0</DocSecurity>
+  <Lines>31</Lines>
+  <Paragraphs>8</Paragraphs>
+  <ScaleCrop>false</ScaleCrop>
+  <HeadingPairs>
+    <vt:vector size="2" baseType="variant">
+      <vt:variant>
+        <vt:lpstr>Title</vt:lpstr>
+      </vt:variant>
+      <vt:variant>
+        <vt:i4>1</vt:i4>
+      </vt:variant>
+    </vt:vector>
+  </HeadingPairs>
+  <TitlesOfParts>
+    <vt:vector size="1" baseType="lpstr">
+      <vt:lpstr/>
+    </vt:vector>
+  </TitlesOfParts>
+  <Company/>
+  <LinksUpToDate>false</LinksUpToDate>
+  <CharactersWithSpaces>4408</CharactersWithSpaces>
+  <SharedDoc>false</SharedDoc>
+  <HyperlinksChanged>false</HyperlinksChanged>
+  <AppVersion>16.0000</AppVersion>
+</Properties>
+</file>
+
+<file path=docProps\core.xml><?xml version="1.0" encoding="utf-8"?>
+<cp:coreProperties xmlns:cp="http://schemas.openxmlformats.org/package/2006/metadata/core-properties" xmlns:dc="http://purl.org/dc/elements/1.1/" xmlns:dcterms="http://purl.org/dc/terms/" xmlns:dcmitype="http://purl.org/dc/dcmitype/" xmlns:xsi="http://www.w3.org/2001/XMLSchema-instance">
+  <dc:creator>Iusup Abduliaparov</dc:creator>
+  <cp:lastModifiedBy>Yusup Abdulyaparov</cp:lastModifiedBy>
+  <cp:revision>7</cp:revision>
+  <dcterms:created xsi:type="dcterms:W3CDTF">2026-05-03T18:37:00Z</dcterms:created>
+  <dcterms:modified xsi:type="dcterms:W3CDTF">2026-05-06T00:03:00Z</dcterms:modified>
+</cp:coreProperties>
+</file>
+
+<file path=word\document.xml><?xml version="1.0" encoding="utf-8"?>
 <w:document xmlns:wpc="http://schemas.microsoft.com/office/word/2010/wordprocessingCanvas" xmlns:cx="http://schemas.microsoft.com/office/drawing/2014/chartex" xmlns:cx1="http://schemas.microsoft.com/office/drawing/2015/9/8/chartex" xmlns:cx2="http://schemas.microsoft.com/office/drawing/2015/10/21/chartex" xmlns:cx3="http://schemas.microsoft.com/office/drawing/2016/5/9/chartex" xmlns:cx4="http://schemas.microsoft.com/office/drawing/2016/5/10/chartex" xmlns:cx5="http://schemas.microsoft.com/office/drawing/2016/5/11/chartex" xmlns:cx6="http://schemas.microsoft.com/office/drawing/2016/5/12/chartex" xmlns:cx7="http://schemas.microsoft.com/office/drawing/2016/5/13/chartex" xmlns:cx8="http://schemas.microsoft.com/office/drawing/2016/5/14/chartex" xmlns:mc="http://schemas.openxmlformats.org/markup-compatibility/2006" xmlns:aink="http://schemas.microsoft.com/office/drawing/2016/ink" xmlns:am3d="http://schemas.microsoft.com/office/drawing/2017/model3d" xmlns:o="urn:schemas-microsoft-com:office:office" xmlns:oel="http://schemas.microsoft.com/office/2019/extlst" xmlns:r="http://schemas.openxmlformats.org/officeDocument/2006/relationships" xmlns:m="http://schemas.openxmlformats.org/officeDocument/2006/math" xmlns:v="urn:schemas-microsoft-com:vml" xmlns:wp14="http://schemas.microsoft.com/office/word/2010/wordprocessingDrawing" xmlns:wp="http://schemas.openxmlformats.org/drawingml/2006/wordprocessingDrawing" xmlns:w10="urn:schemas-microsoft-com:office:word" xmlns:w="http://schemas.openxmlformats.org/wordprocessingml/2006/main" xmlns:w14="http://schemas.microsoft.com/office/word/2010/wordml" xmlns:w15="http://schemas.microsoft.com/office/word/2012/wordml" xmlns:w16cex="http://schemas.microsoft.com/office/word/2018/wordml/cex" xmlns:w16cid="http://schemas.microsoft.com/office/word/2016/wordml/cid" xmlns:w16="http://schemas.microsoft.com/office/word/2018/wordml" xmlns:w16du="http://schemas.microsoft.com/office/word/2023/wordml/word16du" xmlns:w16sdtdh="http://schemas.microsoft.com/office/word/2020/wordml/sdtdatahash" xmlns:w16sdtfl="http://schemas.microsoft.com/office/word/2024/wordml/sdtformatlock" xmlns:w16se="http://schemas.microsoft.com/office/word/2015/wordml/symex" xmlns:wpg="http://schemas.microsoft.com/office/word/2010/wordprocessingGroup" xmlns:wpi="http://schemas.microsoft.com/office/word/2010/wordprocessingInk" xmlns:wne="http://schemas.microsoft.com/office/word/2006/wordml" xmlns:wps="http://schemas.microsoft.com/office/word/2010/wordprocessingShape" mc:Ignorable="w14 w15 w16se w16cid w16 w16cex w16sdtdh w16sdtfl w16du wp14">
   <w:body>
     <w:p>
       <w:pPr>
         <w:spacing w:after="30"/>
-      </w:pPr>
-      <w:r>
-        <w:rPr>
+        <w:jc w:val="center"/>
+        <w:rPr>
+          <w:rFonts w:ascii="Arial" w:hAnsi="Arial" w:cs="Arial"/>
+        </w:rPr>
+      </w:pPr>
+      <w:r>
+        <w:rPr>
+          <w:rFonts w:ascii="Arial" w:hAnsi="Arial" w:cs="Arial"/>
           <w:b/>
           <w:bCs/>
           <w:color w:val="1A1A1A"/>
@@ -21,20 +72,28 @@
     <w:p>
       <w:pPr>
         <w:spacing w:after="100"/>
-      </w:pPr>
-      <w:r>
-        <w:rPr>
+        <w:jc w:val="center"/>
+        <w:rPr>
+          <w:rFonts w:ascii="Arial" w:hAnsi="Arial" w:cs="Arial"/>
+          <w:sz w:val="22"/>
+          <w:szCs w:val="22"/>
+        </w:rPr>
+      </w:pPr>
+      <w:r>
+        <w:rPr>
+          <w:rFonts w:ascii="Arial" w:hAnsi="Arial" w:cs="Arial"/>
           <w:color w:val="1F4E79"/>
-          <w:sz w:val="21"/>
-          <w:szCs w:val="21"/>
+          <w:sz w:val="22"/>
+          <w:szCs w:val="22"/>
         </w:rPr>
         <w:t xml:space="preserve">Unity C# Engineer | </w:t>
       </w:r>
       <w:r>
         <w:rPr>
+          <w:rFonts w:ascii="Arial" w:hAnsi="Arial" w:cs="Arial"/>
           <w:color w:val="1F4E79"/>
-          <w:sz w:val="21"/>
-          <w:szCs w:val="21"/>
+          <w:sz w:val="22"/>
+          <w:szCs w:val="22"/>
         </w:rPr>
         <w:t>Simulation, WebGL and Real-Time 3D Applications</w:t>
       </w:r>
@@ -42,33 +101,172 @@
     <w:p>
       <w:pPr>
         <w:spacing w:after="30"/>
-      </w:pPr>
-      <w:r>
-        <w:rPr>
-          <w:color w:val="555555"/>
-        </w:rPr>
-        <w:t>Milan, Italy | Open to Hybrid and Remote</w:t>
-      </w:r>
-      <w:r>
-        <w:rPr>
-          <w:color w:val="555555"/>
+        <w:jc w:val="center"/>
+        <w:rPr>
+          <w:rFonts w:ascii="Arial" w:hAnsi="Arial" w:cs="Arial"/>
+          <w:color w:val="000000" w:themeColor="text1"/>
+          <w:sz w:val="22"/>
+          <w:szCs w:val="22"/>
+        </w:rPr>
+      </w:pPr>
+      <w:r>
+        <w:rPr>
+          <w:rFonts w:ascii="Arial" w:hAnsi="Arial" w:cs="Arial"/>
+          <w:color w:val="000000" w:themeColor="text1"/>
+          <w:sz w:val="22"/>
+          <w:szCs w:val="22"/>
+        </w:rPr>
+        <w:t>Milan, Italy</w:t>
+      </w:r>
+      <w:r>
+        <w:rPr>
+          <w:rFonts w:ascii="Arial" w:hAnsi="Arial" w:cs="Arial"/>
+          <w:color w:val="000000" w:themeColor="text1"/>
+          <w:sz w:val="22"/>
+          <w:szCs w:val="22"/>
           <w:lang w:val="en-US"/>
         </w:rPr>
         <w:t xml:space="preserve"> </w:t>
       </w:r>
       <w:r>
         <w:rPr>
-          <w:color w:val="555555"/>
-        </w:rPr>
-        <w:t>|  yusup.abdulyaparov@gmail.com  |  +39 351 443 2325</w:t>
-      </w:r>
-    </w:p>
-    <w:p>
-      <w:r>
-        <w:rPr>
-          <w:color w:val="555555"/>
-        </w:rPr>
-        <w:t>linkedin.com/in/iusup-abduliaparov  |  github.com/Kanopuster  |  English C1  |  Russian Native</w:t>
+          <w:rFonts w:ascii="Arial" w:hAnsi="Arial" w:cs="Arial"/>
+          <w:color w:val="000000" w:themeColor="text1"/>
+          <w:sz w:val="22"/>
+          <w:szCs w:val="22"/>
+        </w:rPr>
+        <w:t>|</w:t>
+      </w:r>
+      <w:r>
+        <w:rPr>
+          <w:rFonts w:ascii="Arial" w:hAnsi="Arial" w:cs="Arial"/>
+          <w:color w:val="000000" w:themeColor="text1"/>
+          <w:sz w:val="22"/>
+          <w:szCs w:val="22"/>
+          <w:lang w:val="en-US"/>
+        </w:rPr>
+        <w:t xml:space="preserve"> </w:t>
+      </w:r>
+      <w:hyperlink r:id="rId5" w:history="1">
+        <w:r>
+          <w:rPr>
+            <w:rStyle w:val="Hyperlink"/>
+            <w:rFonts w:ascii="Arial" w:hAnsi="Arial" w:cs="Arial"/>
+            <w:color w:val="000000" w:themeColor="text1"/>
+            <w:sz w:val="22"/>
+            <w:szCs w:val="22"/>
+          </w:rPr>
+          <w:t>yusup.abdulyaparov@gmail.com</w:t>
+        </w:r>
+      </w:hyperlink>
+      <w:r>
+        <w:rPr>
+          <w:rFonts w:ascii="Arial" w:hAnsi="Arial" w:cs="Arial"/>
+          <w:color w:val="000000" w:themeColor="text1"/>
+          <w:sz w:val="22"/>
+          <w:szCs w:val="22"/>
+          <w:lang w:val="en-US"/>
+        </w:rPr>
+        <w:t xml:space="preserve"> </w:t>
+      </w:r>
+      <w:r>
+        <w:rPr>
+          <w:rFonts w:ascii="Arial" w:hAnsi="Arial" w:cs="Arial"/>
+          <w:color w:val="000000" w:themeColor="text1"/>
+          <w:sz w:val="22"/>
+          <w:szCs w:val="22"/>
+        </w:rPr>
+        <w:t>|</w:t>
+      </w:r>
+      <w:r>
+        <w:rPr>
+          <w:rFonts w:ascii="Arial" w:hAnsi="Arial" w:cs="Arial"/>
+          <w:color w:val="000000" w:themeColor="text1"/>
+          <w:sz w:val="22"/>
+          <w:szCs w:val="22"/>
+          <w:lang w:val="en-US"/>
+        </w:rPr>
+        <w:t xml:space="preserve"> </w:t>
+      </w:r>
+      <w:r>
+        <w:rPr>
+          <w:rFonts w:ascii="Arial" w:hAnsi="Arial" w:cs="Arial"/>
+          <w:color w:val="000000" w:themeColor="text1"/>
+          <w:sz w:val="22"/>
+          <w:szCs w:val="22"/>
+        </w:rPr>
+        <w:t>+39 351 443 2325</w:t>
+      </w:r>
+      <w:r>
+        <w:rPr>
+          <w:rFonts w:ascii="Arial" w:hAnsi="Arial" w:cs="Arial"/>
+          <w:color w:val="000000" w:themeColor="text1"/>
+          <w:sz w:val="22"/>
+          <w:szCs w:val="22"/>
+          <w:lang w:val="en-US"/>
+        </w:rPr>
+        <w:t xml:space="preserve"> |</w:t>
+      </w:r>
+      <w:r>
+        <w:rPr>
+          <w:rFonts w:ascii="Arial" w:hAnsi="Arial" w:cs="Arial"/>
+          <w:b/>
+          <w:bCs/>
+          <w:color w:val="000000" w:themeColor="text1"/>
+          <w:sz w:val="22"/>
+          <w:szCs w:val="22"/>
+          <w:lang w:val="en-US"/>
+        </w:rPr>
+        <w:t xml:space="preserve"> </w:t>
+      </w:r>
+      <w:hyperlink r:id="rId6" w:history="1">
+        <w:r>
+          <w:rPr>
+            <w:rStyle w:val="Hyperlink"/>
+            <w:rFonts w:ascii="Arial" w:hAnsi="Arial" w:cs="Arial"/>
+            <w:b/>
+            <w:bCs/>
+            <w:color w:val="000000" w:themeColor="text1"/>
+            <w:sz w:val="22"/>
+            <w:szCs w:val="22"/>
+            <w:lang w:val="en-US"/>
+          </w:rPr>
+          <w:t>Portfolio</w:t>
+        </w:r>
+      </w:hyperlink>
+      <w:r>
+        <w:rPr>
+          <w:rFonts w:ascii="Arial" w:hAnsi="Arial" w:cs="Arial"/>
+          <w:color w:val="000000" w:themeColor="text1"/>
+          <w:sz w:val="22"/>
+          <w:szCs w:val="22"/>
+          <w:lang w:val="en-US"/>
+        </w:rPr>
+        <w:t xml:space="preserve"> | </w:t>
+      </w:r>
+      <w:hyperlink r:id="rId7" w:history="1">
+        <w:r>
+          <w:rPr>
+            <w:rStyle w:val="Hyperlink"/>
+            <w:rFonts w:ascii="Arial" w:hAnsi="Arial" w:cs="Arial"/>
+            <w:b/>
+            <w:bCs/>
+            <w:color w:val="000000" w:themeColor="text1"/>
+            <w:sz w:val="22"/>
+            <w:szCs w:val="22"/>
+            <w:lang w:val="en-US"/>
+          </w:rPr>
+          <w:t>LinkedIn</w:t>
+        </w:r>
+      </w:hyperlink>
+      <w:r>
+        <w:rPr>
+          <w:rFonts w:ascii="Arial" w:hAnsi="Arial" w:cs="Arial"/>
+          <w:color w:val="000000" w:themeColor="text1"/>
+          <w:sz w:val="22"/>
+          <w:szCs w:val="22"/>
+        </w:rPr>
+        <w:t xml:space="preserve">  </w:t>
       </w:r>
     </w:p>
     <w:p>
@@ -77,54 +275,69 @@
           <w:bottom w:val="single" w:sz="6" w:space="3" w:color="1F4E79"/>
         </w:pBdr>
         <w:spacing w:before="140" w:after="60"/>
-      </w:pPr>
-      <w:r>
-        <w:rPr>
+        <w:rPr>
+          <w:rFonts w:ascii="Arial" w:hAnsi="Arial" w:cs="Arial"/>
+          <w:sz w:val="22"/>
+          <w:szCs w:val="22"/>
+        </w:rPr>
+      </w:pPr>
+      <w:r>
+        <w:rPr>
+          <w:rFonts w:ascii="Arial" w:hAnsi="Arial" w:cs="Arial"/>
           <w:b/>
           <w:bCs/>
           <w:color w:val="1F4E79"/>
           <w:spacing w:val="20"/>
-          <w:sz w:val="21"/>
-          <w:szCs w:val="21"/>
-        </w:rPr>
-        <w:t>PROFILE</w:t>
+          <w:sz w:val="22"/>
+          <w:szCs w:val="22"/>
+        </w:rPr>
+        <w:t>PROFESSIONAL SUMMARY</w:t>
       </w:r>
     </w:p>
     <w:p>
       <w:pPr>
         <w:spacing w:after="40"/>
-      </w:pPr>
-      <w:r>
-        <w:rPr>
-          <w:color w:val="1A1A1A"/>
-          <w:sz w:val="18"/>
-          <w:szCs w:val="18"/>
+        <w:rPr>
+          <w:rFonts w:ascii="Arial" w:hAnsi="Arial" w:cs="Arial"/>
+          <w:sz w:val="20"/>
+          <w:szCs w:val="20"/>
+        </w:rPr>
+      </w:pPr>
+      <w:r>
+        <w:rPr>
+          <w:rFonts w:ascii="Arial" w:hAnsi="Arial" w:cs="Arial"/>
+          <w:color w:val="1A1A1A"/>
+          <w:sz w:val="20"/>
+          <w:szCs w:val="20"/>
           <w:lang w:val="en-US"/>
         </w:rPr>
         <w:t>I</w:t>
       </w:r>
       <w:r>
         <w:rPr>
-          <w:color w:val="1A1A1A"/>
-          <w:sz w:val="18"/>
-          <w:szCs w:val="18"/>
+          <w:rFonts w:ascii="Arial" w:hAnsi="Arial" w:cs="Arial"/>
+          <w:color w:val="1A1A1A"/>
+          <w:sz w:val="20"/>
+          <w:szCs w:val="20"/>
         </w:rPr>
         <w:t xml:space="preserve"> build interactive training and visualization systems with strong attention to architecture, performance and production constraints. Recent work includes a medical angiography simulator with real-time X-ray-style rendering, catheter interaction, procedural workflow logic and a hardware-oriented C-arm control layer. Previously shipped and optimized a high-traffic Unity WebGL</w:t>
       </w:r>
       <w:r>
         <w:rPr>
-          <w:color w:val="1A1A1A"/>
-          <w:sz w:val="18"/>
-          <w:szCs w:val="18"/>
+          <w:rFonts w:ascii="Arial" w:hAnsi="Arial" w:cs="Arial"/>
+          <w:color w:val="1A1A1A"/>
+          <w:sz w:val="20"/>
+          <w:szCs w:val="20"/>
           <w:lang w:val="en-US"/>
         </w:rPr>
         <w:t xml:space="preserve"> </w:t>
       </w:r>
       <w:r>
         <w:rPr>
-          <w:color w:val="1A1A1A"/>
-          <w:sz w:val="18"/>
-          <w:szCs w:val="18"/>
+          <w:rFonts w:ascii="Arial" w:hAnsi="Arial" w:cs="Arial"/>
+          <w:color w:val="1A1A1A"/>
+          <w:sz w:val="20"/>
+          <w:szCs w:val="20"/>
         </w:rPr>
         <w:t>product with 9M+ users.</w:t>
       </w:r>
@@ -135,104 +348,215 @@
           <w:bottom w:val="single" w:sz="6" w:space="3" w:color="1F4E79"/>
         </w:pBdr>
         <w:spacing w:before="140" w:after="60"/>
-      </w:pPr>
-      <w:r>
-        <w:rPr>
+        <w:rPr>
+          <w:rFonts w:ascii="Arial" w:hAnsi="Arial" w:cs="Arial"/>
+          <w:sz w:val="22"/>
+          <w:szCs w:val="22"/>
+        </w:rPr>
+      </w:pPr>
+      <w:r>
+        <w:rPr>
+          <w:rFonts w:ascii="Arial" w:hAnsi="Arial" w:cs="Arial"/>
           <w:b/>
           <w:bCs/>
           <w:color w:val="1F4E79"/>
           <w:spacing w:val="20"/>
-          <w:sz w:val="21"/>
-          <w:szCs w:val="21"/>
-        </w:rPr>
-        <w:t>EXPERIENCE</w:t>
-      </w:r>
-    </w:p>
-    <w:p>
-      <w:pPr>
-        <w:spacing w:before="100" w:after="20"/>
-      </w:pPr>
-      <w:r>
-        <w:rPr>
-          <w:b/>
-          <w:bCs/>
-          <w:color w:val="1A1A1A"/>
-          <w:sz w:val="20"/>
-          <w:szCs w:val="20"/>
-        </w:rPr>
-        <w:t>Unity Simulation Engineer</w:t>
-      </w:r>
-      <w:r>
-        <w:rPr>
+          <w:sz w:val="22"/>
+          <w:szCs w:val="22"/>
+        </w:rPr>
+        <w:t>WORK EXPERIENCE</w:t>
+      </w:r>
+    </w:p>
+    <w:p>
+      <w:pPr>
+        <w:keepNext/>
+        <w:tabs>
+          <w:tab w:val="right" w:pos="10106"/>
+        </w:tabs>
+        <w:spacing w:before="100"/>
+        <w:rPr>
+          <w:rFonts w:ascii="Arial" w:hAnsi="Arial" w:cs="Arial"/>
+          <w:sz w:val="20"/>
+          <w:szCs w:val="20"/>
+          <w:lang w:val="en-US"/>
+        </w:rPr>
+      </w:pPr>
+      <w:r>
+        <w:rPr>
+          <w:rFonts w:ascii="Arial" w:hAnsi="Arial" w:cs="Arial"/>
           <w:b/>
           <w:bCs/>
           <w:color w:val="1F4E79"/>
-          <w:sz w:val="20"/>
-          <w:szCs w:val="20"/>
-        </w:rPr>
-        <w:t xml:space="preserve"> — Medical Training Simulator (NDA)</w:t>
-      </w:r>
-      <w:r>
-        <w:rPr>
+          <w:sz w:val="22"/>
+          <w:szCs w:val="22"/>
+        </w:rPr>
+        <w:t>Medical Training Simulator (NDA)</w:t>
+      </w:r>
+      <w:r>
+        <w:tab/>
+      </w:r>
+      <w:r>
+        <w:rPr>
+          <w:rFonts w:ascii="Arial" w:hAnsi="Arial" w:cs="Arial"/>
+          <w:color w:val="555555"/>
+          <w:sz w:val="20"/>
+          <w:szCs w:val="20"/>
+        </w:rPr>
+        <w:t>Remote</w:t>
+      </w:r>
+      <w:r>
+        <w:rPr>
+          <w:rFonts w:ascii="Arial" w:hAnsi="Arial" w:cs="Arial"/>
+          <w:color w:val="555555"/>
+          <w:sz w:val="20"/>
+          <w:szCs w:val="20"/>
+          <w:lang w:val="en-US"/>
+        </w:rPr>
+        <w:t xml:space="preserve"> </w:t>
+      </w:r>
+      <w:r>
+        <w:rPr>
+          <w:rFonts w:ascii="Arial" w:hAnsi="Arial" w:cs="Arial"/>
+          <w:color w:val="555555"/>
+          <w:sz w:val="20"/>
+          <w:szCs w:val="20"/>
+          <w:lang w:val="en-US"/>
+        </w:rPr>
+        <w:t>(</w:t>
+      </w:r>
+      <w:r>
+        <w:rPr>
+          <w:rFonts w:ascii="Arial" w:hAnsi="Arial" w:cs="Arial"/>
+          <w:color w:val="555555"/>
+          <w:sz w:val="20"/>
+          <w:szCs w:val="20"/>
+          <w:lang w:val="en-US"/>
+        </w:rPr>
+        <w:t>contract</w:t>
+      </w:r>
+      <w:r>
+        <w:rPr>
+          <w:rFonts w:ascii="Arial" w:hAnsi="Arial" w:cs="Arial"/>
+          <w:color w:val="555555"/>
+          <w:sz w:val="20"/>
+          <w:szCs w:val="20"/>
+          <w:lang w:val="en-US"/>
+        </w:rPr>
+        <w:t>)</w:t>
+      </w:r>
+    </w:p>
+    <w:p>
+      <w:pPr>
+        <w:tabs>
+          <w:tab w:val="right" w:pos="10106"/>
+        </w:tabs>
+        <w:spacing w:after="20"/>
+        <w:rPr>
+          <w:rFonts w:ascii="Arial" w:hAnsi="Arial" w:cs="Arial"/>
+          <w:sz w:val="20"/>
+          <w:szCs w:val="20"/>
+        </w:rPr>
+      </w:pPr>
+      <w:r>
+        <w:rPr>
+          <w:rFonts w:ascii="Arial" w:hAnsi="Arial" w:cs="Arial"/>
+          <w:b/>
+          <w:bCs/>
+          <w:color w:val="1A1A1A"/>
+          <w:sz w:val="22"/>
+          <w:szCs w:val="22"/>
+        </w:rPr>
+        <w:t>Unity Simulation Engineer</w:t>
+      </w:r>
+      <w:r>
+        <w:tab/>
+      </w:r>
+      <w:r>
+        <w:rPr>
+          <w:rFonts w:ascii="Arial" w:hAnsi="Arial" w:cs="Arial"/>
+          <w:color w:val="555555"/>
+          <w:sz w:val="20"/>
+          <w:szCs w:val="20"/>
+        </w:rPr>
+        <w:t>2025 – Present</w:t>
+      </w:r>
+    </w:p>
+    <w:p>
+      <w:pPr>
+        <w:spacing w:after="30"/>
+        <w:rPr>
+          <w:rFonts w:ascii="Arial" w:hAnsi="Arial" w:cs="Arial"/>
+          <w:color w:val="4B4B4B"/>
+          <w:sz w:val="20"/>
+          <w:szCs w:val="20"/>
+        </w:rPr>
+      </w:pPr>
+      <w:r>
+        <w:rPr>
+          <w:rFonts w:ascii="Arial" w:hAnsi="Arial" w:cs="Arial"/>
           <w:i/>
           <w:iCs/>
-          <w:color w:val="555555"/>
-        </w:rPr>
-        <w:t xml:space="preserve">   2025 – Present</w:t>
-      </w:r>
-    </w:p>
-    <w:p>
-      <w:pPr>
-        <w:spacing w:after="30"/>
-      </w:pPr>
-      <w:r>
-        <w:rPr>
+          <w:color w:val="4B4B4B"/>
+          <w:sz w:val="20"/>
+          <w:szCs w:val="20"/>
+        </w:rPr>
+        <w:t>Building core Unity systems for an angiography training simulator covering X-ray-style visualization, guidewire</w:t>
+      </w:r>
+      <w:r>
+        <w:rPr>
+          <w:rFonts w:ascii="Arial" w:hAnsi="Arial" w:cs="Arial"/>
           <w:i/>
           <w:iCs/>
-          <w:color w:val="555555"/>
-        </w:rPr>
-        <w:t>Building core Unity systems for an angiography training simulator covering X-ray-style visualization, guidewire</w:t>
-      </w:r>
-      <w:r>
-        <w:rPr>
+          <w:color w:val="4B4B4B"/>
+          <w:sz w:val="20"/>
+          <w:szCs w:val="20"/>
+          <w:lang w:val="en-US"/>
+        </w:rPr>
+        <w:t xml:space="preserve"> </w:t>
+      </w:r>
+      <w:r>
+        <w:rPr>
+          <w:rFonts w:ascii="Arial" w:hAnsi="Arial" w:cs="Arial"/>
           <w:i/>
           <w:iCs/>
-          <w:color w:val="555555"/>
+          <w:color w:val="4B4B4B"/>
+          <w:sz w:val="20"/>
+          <w:szCs w:val="20"/>
           <w:lang w:val="en-US"/>
         </w:rPr>
-        <w:t xml:space="preserve"> </w:t>
-      </w:r>
-      <w:r>
-        <w:rPr>
+        <w:t xml:space="preserve">and </w:t>
+      </w:r>
+      <w:r>
+        <w:rPr>
+          <w:rFonts w:ascii="Arial" w:hAnsi="Arial" w:cs="Arial"/>
           <w:i/>
           <w:iCs/>
-          <w:color w:val="555555"/>
-          <w:lang w:val="en-US"/>
-        </w:rPr>
-        <w:t xml:space="preserve">and </w:t>
-      </w:r>
-      <w:r>
-        <w:rPr>
+          <w:color w:val="4B4B4B"/>
+          <w:sz w:val="20"/>
+          <w:szCs w:val="20"/>
+        </w:rPr>
+        <w:t>catheter interaction, contrast injection, C-arm operation and balloon</w:t>
+      </w:r>
+      <w:r>
+        <w:rPr>
+          <w:rFonts w:ascii="Arial" w:hAnsi="Arial" w:cs="Arial"/>
           <w:i/>
           <w:iCs/>
-          <w:color w:val="555555"/>
-        </w:rPr>
-        <w:t>catheter interaction, contrast injection, C-arm operation and balloon</w:t>
-      </w:r>
-      <w:r>
-        <w:rPr>
+          <w:color w:val="4B4B4B"/>
+          <w:sz w:val="20"/>
+          <w:szCs w:val="20"/>
+          <w:lang w:val="en-US"/>
+        </w:rPr>
+        <w:t xml:space="preserve"> </w:t>
+      </w:r>
+      <w:r>
+        <w:rPr>
+          <w:rFonts w:ascii="Arial" w:hAnsi="Arial" w:cs="Arial"/>
           <w:i/>
           <w:iCs/>
-          <w:color w:val="555555"/>
-          <w:lang w:val="en-US"/>
-        </w:rPr>
-        <w:t xml:space="preserve"> </w:t>
-      </w:r>
-      <w:r>
-        <w:rPr>
-          <w:i/>
-          <w:iCs/>
-          <w:color w:val="555555"/>
+          <w:color w:val="4B4B4B"/>
+          <w:sz w:val="20"/>
+          <w:szCs w:val="20"/>
         </w:rPr>
         <w:t>stent procedure logic.</w:t>
       </w:r>
@@ -245,10 +569,18 @@
           <w:numId w:val="2"/>
         </w:numPr>
         <w:spacing w:after="10"/>
-      </w:pPr>
-      <w:r>
-        <w:rPr>
-          <w:color w:val="1A1A1A"/>
+        <w:rPr>
+          <w:rFonts w:ascii="Arial" w:hAnsi="Arial" w:cs="Arial"/>
+          <w:sz w:val="20"/>
+          <w:szCs w:val="20"/>
+        </w:rPr>
+      </w:pPr>
+      <w:r>
+        <w:rPr>
+          <w:rFonts w:ascii="Arial" w:hAnsi="Arial" w:cs="Arial"/>
+          <w:color w:val="1A1A1A"/>
+          <w:sz w:val="20"/>
+          <w:szCs w:val="20"/>
         </w:rPr>
         <w:t>Worked with clinical reviewers to convert procedure requirements into simulator states, validation rules and instrument profiles.</w:t>
       </w:r>
@@ -261,24 +593,38 @@
           <w:numId w:val="2"/>
         </w:numPr>
         <w:spacing w:after="10"/>
-      </w:pPr>
-      <w:r>
-        <w:rPr>
-          <w:color w:val="1A1A1A"/>
+        <w:rPr>
+          <w:rFonts w:ascii="Arial" w:hAnsi="Arial" w:cs="Arial"/>
+          <w:sz w:val="20"/>
+          <w:szCs w:val="20"/>
+        </w:rPr>
+      </w:pPr>
+      <w:r>
+        <w:rPr>
+          <w:rFonts w:ascii="Arial" w:hAnsi="Arial" w:cs="Arial"/>
+          <w:color w:val="1A1A1A"/>
+          <w:sz w:val="20"/>
+          <w:szCs w:val="20"/>
         </w:rPr>
         <w:t xml:space="preserve">Built a </w:t>
       </w:r>
       <w:r>
         <w:rPr>
+          <w:rFonts w:ascii="Arial" w:hAnsi="Arial" w:cs="Arial"/>
           <w:b/>
           <w:bCs/>
           <w:color w:val="1A1A1A"/>
+          <w:sz w:val="20"/>
+          <w:szCs w:val="20"/>
         </w:rPr>
         <w:t>real-time URP X-ray-style rendering pipeline</w:t>
       </w:r>
       <w:r>
         <w:rPr>
-          <w:color w:val="1A1A1A"/>
+          <w:rFonts w:ascii="Arial" w:hAnsi="Arial" w:cs="Arial"/>
+          <w:color w:val="1A1A1A"/>
+          <w:sz w:val="20"/>
+          <w:szCs w:val="20"/>
         </w:rPr>
         <w:t xml:space="preserve"> using density accumulation, multi-pass composition and instrument overlays.</w:t>
       </w:r>
@@ -291,24 +637,38 @@
           <w:numId w:val="2"/>
         </w:numPr>
         <w:spacing w:after="10"/>
-      </w:pPr>
-      <w:r>
-        <w:rPr>
-          <w:color w:val="1A1A1A"/>
+        <w:rPr>
+          <w:rFonts w:ascii="Arial" w:hAnsi="Arial" w:cs="Arial"/>
+          <w:sz w:val="20"/>
+          <w:szCs w:val="20"/>
+        </w:rPr>
+      </w:pPr>
+      <w:r>
+        <w:rPr>
+          <w:rFonts w:ascii="Arial" w:hAnsi="Arial" w:cs="Arial"/>
+          <w:color w:val="1A1A1A"/>
+          <w:sz w:val="20"/>
+          <w:szCs w:val="20"/>
         </w:rPr>
         <w:t xml:space="preserve">Implemented </w:t>
       </w:r>
       <w:r>
         <w:rPr>
+          <w:rFonts w:ascii="Arial" w:hAnsi="Arial" w:cs="Arial"/>
           <w:b/>
           <w:bCs/>
           <w:color w:val="1A1A1A"/>
+          <w:sz w:val="20"/>
+          <w:szCs w:val="20"/>
         </w:rPr>
         <w:t>guidewire and catheter interaction</w:t>
       </w:r>
       <w:r>
         <w:rPr>
-          <w:color w:val="1A1A1A"/>
+          <w:rFonts w:ascii="Arial" w:hAnsi="Arial" w:cs="Arial"/>
+          <w:color w:val="1A1A1A"/>
+          <w:sz w:val="20"/>
+          <w:szCs w:val="20"/>
         </w:rPr>
         <w:t>, proximal-end actuation and bifurcation handling, supporting 8 instrument profiles without per-instrument code branches.</w:t>
       </w:r>
@@ -321,24 +681,38 @@
           <w:numId w:val="2"/>
         </w:numPr>
         <w:spacing w:after="10"/>
-      </w:pPr>
-      <w:r>
-        <w:rPr>
-          <w:color w:val="1A1A1A"/>
+        <w:rPr>
+          <w:rFonts w:ascii="Arial" w:hAnsi="Arial" w:cs="Arial"/>
+          <w:sz w:val="20"/>
+          <w:szCs w:val="20"/>
+        </w:rPr>
+      </w:pPr>
+      <w:r>
+        <w:rPr>
+          <w:rFonts w:ascii="Arial" w:hAnsi="Arial" w:cs="Arial"/>
+          <w:color w:val="1A1A1A"/>
+          <w:sz w:val="20"/>
+          <w:szCs w:val="20"/>
         </w:rPr>
         <w:t xml:space="preserve">Developed a </w:t>
       </w:r>
       <w:r>
         <w:rPr>
+          <w:rFonts w:ascii="Arial" w:hAnsi="Arial" w:cs="Arial"/>
           <w:b/>
           <w:bCs/>
           <w:color w:val="1A1A1A"/>
+          <w:sz w:val="20"/>
+          <w:szCs w:val="20"/>
         </w:rPr>
         <w:t>procedural balloon/stent workflow</w:t>
       </w:r>
       <w:r>
         <w:rPr>
-          <w:color w:val="1A1A1A"/>
+          <w:rFonts w:ascii="Arial" w:hAnsi="Arial" w:cs="Arial"/>
+          <w:color w:val="1A1A1A"/>
+          <w:sz w:val="20"/>
+          <w:szCs w:val="20"/>
         </w:rPr>
         <w:t xml:space="preserve"> with radius control, vessel deformation, state validation and deployment gating based on positioning and inflation state.</w:t>
       </w:r>
@@ -351,24 +725,38 @@
           <w:numId w:val="2"/>
         </w:numPr>
         <w:spacing w:after="10"/>
-      </w:pPr>
-      <w:r>
-        <w:rPr>
-          <w:color w:val="1A1A1A"/>
+        <w:rPr>
+          <w:rFonts w:ascii="Arial" w:hAnsi="Arial" w:cs="Arial"/>
+          <w:sz w:val="20"/>
+          <w:szCs w:val="20"/>
+        </w:rPr>
+      </w:pPr>
+      <w:r>
+        <w:rPr>
+          <w:rFonts w:ascii="Arial" w:hAnsi="Arial" w:cs="Arial"/>
+          <w:color w:val="1A1A1A"/>
+          <w:sz w:val="20"/>
+          <w:szCs w:val="20"/>
         </w:rPr>
         <w:t xml:space="preserve">Designed a </w:t>
       </w:r>
       <w:r>
         <w:rPr>
+          <w:rFonts w:ascii="Arial" w:hAnsi="Arial" w:cs="Arial"/>
           <w:b/>
           <w:bCs/>
           <w:color w:val="1A1A1A"/>
+          <w:sz w:val="20"/>
+          <w:szCs w:val="20"/>
         </w:rPr>
         <w:t>hardware-abstraction layer for C-arm controls</w:t>
       </w:r>
       <w:r>
         <w:rPr>
-          <w:color w:val="1A1A1A"/>
+          <w:rFonts w:ascii="Arial" w:hAnsi="Arial" w:cs="Arial"/>
+          <w:color w:val="1A1A1A"/>
+          <w:sz w:val="20"/>
+          <w:szCs w:val="20"/>
         </w:rPr>
         <w:t>, separating simulator logic from input devices and preparing the system for future physical rig integration.</w:t>
       </w:r>
@@ -381,24 +769,38 @@
           <w:numId w:val="2"/>
         </w:numPr>
         <w:spacing w:after="10"/>
-      </w:pPr>
-      <w:r>
-        <w:rPr>
-          <w:color w:val="1A1A1A"/>
+        <w:rPr>
+          <w:rFonts w:ascii="Arial" w:hAnsi="Arial" w:cs="Arial"/>
+          <w:sz w:val="20"/>
+          <w:szCs w:val="20"/>
+        </w:rPr>
+      </w:pPr>
+      <w:r>
+        <w:rPr>
+          <w:rFonts w:ascii="Arial" w:hAnsi="Arial" w:cs="Arial"/>
+          <w:color w:val="1A1A1A"/>
+          <w:sz w:val="20"/>
+          <w:szCs w:val="20"/>
         </w:rPr>
         <w:t xml:space="preserve">Built a </w:t>
       </w:r>
       <w:r>
         <w:rPr>
+          <w:rFonts w:ascii="Arial" w:hAnsi="Arial" w:cs="Arial"/>
           <w:b/>
           <w:bCs/>
           <w:color w:val="1A1A1A"/>
+          <w:sz w:val="20"/>
+          <w:szCs w:val="20"/>
         </w:rPr>
         <w:t>ScriptableObject-driven instrument framework</w:t>
       </w:r>
       <w:r>
         <w:rPr>
-          <w:color w:val="1A1A1A"/>
+          <w:rFonts w:ascii="Arial" w:hAnsi="Arial" w:cs="Arial"/>
+          <w:color w:val="1A1A1A"/>
+          <w:sz w:val="20"/>
+          <w:szCs w:val="20"/>
         </w:rPr>
         <w:t xml:space="preserve"> for collision settings, X-ray layer mapping and reusable rig slots, allowing new instrument profiles to be added through configuration rather than code.</w:t>
       </w:r>
@@ -406,146 +808,137 @@
     <w:p>
       <w:pPr>
         <w:spacing w:before="30" w:after="60"/>
-      </w:pPr>
-      <w:r>
-        <w:rPr>
+        <w:rPr>
+          <w:rFonts w:ascii="Arial" w:hAnsi="Arial" w:cs="Arial"/>
+          <w:sz w:val="20"/>
+          <w:szCs w:val="20"/>
+        </w:rPr>
+      </w:pPr>
+      <w:r>
+        <w:rPr>
+          <w:rFonts w:ascii="Arial" w:hAnsi="Arial" w:cs="Arial"/>
           <w:b/>
           <w:bCs/>
           <w:color w:val="1A1A1A"/>
+          <w:sz w:val="20"/>
+          <w:szCs w:val="20"/>
         </w:rPr>
         <w:t xml:space="preserve">Tech: </w:t>
       </w:r>
       <w:r>
         <w:rPr>
-          <w:color w:val="1A1A1A"/>
+          <w:rFonts w:ascii="Arial" w:hAnsi="Arial" w:cs="Arial"/>
+          <w:color w:val="1A1A1A"/>
+          <w:sz w:val="20"/>
+          <w:szCs w:val="20"/>
         </w:rPr>
         <w:t>Unity, C#, URP, ShaderLab/HLSL, Burst, custom render features, ScriptableObjects, procedural meshes.</w:t>
       </w:r>
     </w:p>
     <w:p>
       <w:pPr>
-        <w:spacing w:before="100" w:after="20"/>
-      </w:pPr>
-      <w:r>
-        <w:rPr>
-          <w:b/>
-          <w:bCs/>
-          <w:color w:val="1A1A1A"/>
-          <w:sz w:val="20"/>
-          <w:szCs w:val="20"/>
-        </w:rPr>
-        <w:t>Unity Engineer</w:t>
-      </w:r>
-      <w:r>
-        <w:rPr>
-          <w:b/>
-          <w:bCs/>
-          <w:color w:val="1A1A1A"/>
-          <w:sz w:val="20"/>
-          <w:szCs w:val="20"/>
-          <w:lang w:val="en-US"/>
-        </w:rPr>
-        <w:t xml:space="preserve"> </w:t>
-      </w:r>
-      <w:r>
-        <w:rPr>
+        <w:keepNext/>
+        <w:tabs>
+          <w:tab w:val="right" w:pos="10106"/>
+        </w:tabs>
+        <w:spacing w:before="100"/>
+        <w:rPr>
+          <w:rFonts w:ascii="Arial" w:hAnsi="Arial" w:cs="Arial"/>
+          <w:sz w:val="20"/>
+          <w:szCs w:val="20"/>
+        </w:rPr>
+      </w:pPr>
+      <w:r>
+        <w:rPr>
+          <w:rFonts w:ascii="Arial" w:hAnsi="Arial" w:cs="Arial"/>
           <w:b/>
           <w:bCs/>
           <w:color w:val="1F4E79"/>
-          <w:sz w:val="20"/>
-          <w:szCs w:val="20"/>
-        </w:rPr>
-        <w:t>— Aviana Studios, WebGL and Mobile Products</w:t>
-      </w:r>
-      <w:r>
-        <w:rPr>
+          <w:sz w:val="22"/>
+          <w:szCs w:val="22"/>
+        </w:rPr>
+        <w:t>Aviana Studios, WebGL and Mobile Products</w:t>
+      </w:r>
+      <w:r>
+        <w:tab/>
+      </w:r>
+      <w:r>
+        <w:rPr>
+          <w:rFonts w:ascii="Arial" w:hAnsi="Arial" w:cs="Arial"/>
+          <w:color w:val="555555"/>
+          <w:sz w:val="20"/>
+          <w:szCs w:val="20"/>
+        </w:rPr>
+        <w:t>Remote</w:t>
+      </w:r>
+    </w:p>
+    <w:p>
+      <w:pPr>
+        <w:tabs>
+          <w:tab w:val="right" w:pos="10106"/>
+        </w:tabs>
+        <w:spacing w:after="20"/>
+        <w:rPr>
+          <w:rFonts w:ascii="Arial" w:hAnsi="Arial" w:cs="Arial"/>
+          <w:sz w:val="18"/>
+          <w:szCs w:val="18"/>
+          <w:lang w:val="en-US"/>
+        </w:rPr>
+      </w:pPr>
+      <w:r>
+        <w:rPr>
+          <w:rFonts w:ascii="Arial" w:hAnsi="Arial" w:cs="Arial"/>
           <w:b/>
           <w:bCs/>
-          <w:color w:val="1F4E79"/>
+          <w:color w:val="1A1A1A"/>
+          <w:sz w:val="22"/>
+          <w:szCs w:val="22"/>
+        </w:rPr>
+        <w:t>Unity Engineer | Engineering Owner and Co-founder</w:t>
+      </w:r>
+      <w:r>
+        <w:tab/>
+      </w:r>
+      <w:r>
+        <w:rPr>
+          <w:rFonts w:ascii="Arial" w:hAnsi="Arial" w:cs="Arial"/>
+          <w:color w:val="555555"/>
+          <w:sz w:val="20"/>
+          <w:szCs w:val="20"/>
+        </w:rPr>
+        <w:t xml:space="preserve">2023 – </w:t>
+      </w:r>
+      <w:r>
+        <w:rPr>
+          <w:rFonts w:ascii="Arial" w:hAnsi="Arial" w:cs="Arial"/>
+          <w:color w:val="555555"/>
           <w:sz w:val="20"/>
           <w:szCs w:val="20"/>
           <w:lang w:val="en-US"/>
         </w:rPr>
-        <w:t xml:space="preserve"> (E</w:t>
-      </w:r>
-      <w:r>
-        <w:rPr>
-          <w:b/>
-          <w:bCs/>
-          <w:color w:val="1F4E79"/>
-          <w:sz w:val="20"/>
-          <w:szCs w:val="20"/>
-        </w:rPr>
-        <w:t>ngineering owner</w:t>
-      </w:r>
-      <w:r>
-        <w:rPr>
-          <w:b/>
-          <w:bCs/>
-          <w:color w:val="1F4E79"/>
-          <w:sz w:val="20"/>
-          <w:szCs w:val="20"/>
-          <w:lang w:val="en-US"/>
-        </w:rPr>
-        <w:t xml:space="preserve"> and </w:t>
-      </w:r>
-      <w:r>
-        <w:rPr>
-          <w:b/>
-          <w:bCs/>
-          <w:color w:val="1F4E79"/>
-          <w:sz w:val="20"/>
-          <w:szCs w:val="20"/>
-        </w:rPr>
-        <w:t>Co-founder</w:t>
-      </w:r>
-      <w:r>
-        <w:rPr>
-          <w:b/>
-          <w:bCs/>
-          <w:color w:val="1F4E79"/>
-          <w:sz w:val="20"/>
-          <w:szCs w:val="20"/>
-          <w:lang w:val="en-US"/>
-        </w:rPr>
-        <w:t>)</w:t>
-      </w:r>
-      <w:r>
-        <w:rPr>
+        <w:t>2026</w:t>
+      </w:r>
+    </w:p>
+    <w:p>
+      <w:pPr>
+        <w:spacing w:after="30"/>
+        <w:rPr>
+          <w:rFonts w:ascii="Arial" w:hAnsi="Arial" w:cs="Arial"/>
+          <w:color w:val="4B4B4B"/>
+          <w:sz w:val="20"/>
+          <w:szCs w:val="20"/>
+        </w:rPr>
+      </w:pPr>
+      <w:r>
+        <w:rPr>
+          <w:rFonts w:ascii="Arial" w:hAnsi="Arial" w:cs="Arial"/>
           <w:i/>
           <w:iCs/>
-          <w:color w:val="555555"/>
-        </w:rPr>
-        <w:t xml:space="preserve">   2023 – Present</w:t>
-      </w:r>
-    </w:p>
-    <w:p>
-      <w:pPr>
-        <w:spacing w:after="30"/>
-      </w:pPr>
-      <w:r>
-        <w:rPr>
-          <w:i/>
-          <w:iCs/>
-          <w:color w:val="555555"/>
-        </w:rPr>
-        <w:t xml:space="preserve">Co-founded a Unity studio and owned engineering for </w:t>
-      </w:r>
-      <w:r>
-        <w:rPr>
-          <w:i/>
-          <w:iCs/>
-          <w:color w:val="555555"/>
-        </w:rPr>
-        <w:t>high-traffic Unity WebGL/mobile products, including browser and Android game applications</w:t>
-      </w:r>
-      <w:r>
-        <w:rPr>
-          <w:i/>
-          <w:iCs/>
-          <w:color w:val="555555"/>
-        </w:rPr>
-        <w:t>, performance optimization.</w:t>
+          <w:color w:val="4B4B4B"/>
+          <w:sz w:val="20"/>
+          <w:szCs w:val="20"/>
+        </w:rPr>
+        <w:t>Owned Unity engineering for high-traffic WebGL and Android real-time applications, focusing on architecture, runtime performance, build size, release stability and production tooling.</w:t>
       </w:r>
     </w:p>
     <w:p>
@@ -556,37 +949,57 @@
           <w:numId w:val="2"/>
         </w:numPr>
         <w:spacing w:after="10"/>
-      </w:pPr>
-      <w:r>
-        <w:rPr>
-          <w:color w:val="1A1A1A"/>
+        <w:rPr>
+          <w:rFonts w:ascii="Arial" w:hAnsi="Arial" w:cs="Arial"/>
+          <w:sz w:val="20"/>
+          <w:szCs w:val="20"/>
+        </w:rPr>
+      </w:pPr>
+      <w:r>
+        <w:rPr>
+          <w:rFonts w:ascii="Arial" w:hAnsi="Arial" w:cs="Arial"/>
+          <w:color w:val="1A1A1A"/>
+          <w:sz w:val="20"/>
+          <w:szCs w:val="20"/>
         </w:rPr>
         <w:t xml:space="preserve">Reduced WebGL build size from </w:t>
       </w:r>
       <w:r>
         <w:rPr>
+          <w:rFonts w:ascii="Arial" w:hAnsi="Arial" w:cs="Arial"/>
           <w:b/>
           <w:bCs/>
           <w:color w:val="1A1A1A"/>
+          <w:sz w:val="20"/>
+          <w:szCs w:val="20"/>
         </w:rPr>
         <w:t>100 MB to 20 MB</w:t>
       </w:r>
       <w:r>
         <w:rPr>
-          <w:color w:val="1A1A1A"/>
+          <w:rFonts w:ascii="Arial" w:hAnsi="Arial" w:cs="Arial"/>
+          <w:color w:val="1A1A1A"/>
+          <w:sz w:val="20"/>
+          <w:szCs w:val="20"/>
         </w:rPr>
         <w:t xml:space="preserve"> through shader variant scoping, asset stripping and texture</w:t>
       </w:r>
       <w:r>
         <w:rPr>
-          <w:color w:val="1A1A1A"/>
+          <w:rFonts w:ascii="Arial" w:hAnsi="Arial" w:cs="Arial"/>
+          <w:color w:val="1A1A1A"/>
+          <w:sz w:val="20"/>
+          <w:szCs w:val="20"/>
           <w:lang w:val="en-US"/>
         </w:rPr>
         <w:t xml:space="preserve"> </w:t>
       </w:r>
       <w:r>
         <w:rPr>
-          <w:color w:val="1A1A1A"/>
+          <w:rFonts w:ascii="Arial" w:hAnsi="Arial" w:cs="Arial"/>
+          <w:color w:val="1A1A1A"/>
+          <w:sz w:val="20"/>
+          <w:szCs w:val="20"/>
         </w:rPr>
         <w:t>audio re-encoding, improving accessibility for low-bandwidth browser users.</w:t>
       </w:r>
@@ -599,24 +1012,38 @@
           <w:numId w:val="2"/>
         </w:numPr>
         <w:spacing w:after="10"/>
-      </w:pPr>
-      <w:r>
-        <w:rPr>
-          <w:color w:val="1A1A1A"/>
+        <w:rPr>
+          <w:rFonts w:ascii="Arial" w:hAnsi="Arial" w:cs="Arial"/>
+          <w:sz w:val="20"/>
+          <w:szCs w:val="20"/>
+        </w:rPr>
+      </w:pPr>
+      <w:r>
+        <w:rPr>
+          <w:rFonts w:ascii="Arial" w:hAnsi="Arial" w:cs="Arial"/>
+          <w:color w:val="1A1A1A"/>
+          <w:sz w:val="20"/>
+          <w:szCs w:val="20"/>
         </w:rPr>
         <w:t xml:space="preserve">Improved low-end Android performance from </w:t>
       </w:r>
       <w:r>
         <w:rPr>
+          <w:rFonts w:ascii="Arial" w:hAnsi="Arial" w:cs="Arial"/>
           <w:b/>
           <w:bCs/>
           <w:color w:val="1A1A1A"/>
+          <w:sz w:val="20"/>
+          <w:szCs w:val="20"/>
         </w:rPr>
         <w:t>~15 FPS to stable 60 FPS</w:t>
       </w:r>
       <w:r>
         <w:rPr>
-          <w:color w:val="1A1A1A"/>
+          <w:rFonts w:ascii="Arial" w:hAnsi="Arial" w:cs="Arial"/>
+          <w:color w:val="1A1A1A"/>
+          <w:sz w:val="20"/>
+          <w:szCs w:val="20"/>
         </w:rPr>
         <w:t xml:space="preserve"> through GC allocation reduction, pooling, batching, physics-step tuning and profiler-driven optimization.</w:t>
       </w:r>
@@ -629,24 +1056,38 @@
           <w:numId w:val="2"/>
         </w:numPr>
         <w:spacing w:after="10"/>
-      </w:pPr>
-      <w:r>
-        <w:rPr>
-          <w:color w:val="1A1A1A"/>
+        <w:rPr>
+          <w:rFonts w:ascii="Arial" w:hAnsi="Arial" w:cs="Arial"/>
+          <w:sz w:val="20"/>
+          <w:szCs w:val="20"/>
+        </w:rPr>
+      </w:pPr>
+      <w:r>
+        <w:rPr>
+          <w:rFonts w:ascii="Arial" w:hAnsi="Arial" w:cs="Arial"/>
+          <w:color w:val="1A1A1A"/>
+          <w:sz w:val="20"/>
+          <w:szCs w:val="20"/>
         </w:rPr>
         <w:t xml:space="preserve">Designed a </w:t>
       </w:r>
       <w:r>
         <w:rPr>
+          <w:rFonts w:ascii="Arial" w:hAnsi="Arial" w:cs="Arial"/>
           <w:b/>
           <w:bCs/>
           <w:color w:val="1A1A1A"/>
+          <w:sz w:val="20"/>
+          <w:szCs w:val="20"/>
         </w:rPr>
         <w:t>reusable Unity architecture</w:t>
       </w:r>
       <w:r>
         <w:rPr>
-          <w:color w:val="1A1A1A"/>
+          <w:rFonts w:ascii="Arial" w:hAnsi="Arial" w:cs="Arial"/>
+          <w:color w:val="1A1A1A"/>
+          <w:sz w:val="20"/>
+          <w:szCs w:val="20"/>
         </w:rPr>
         <w:t xml:space="preserve"> with DI, hierarchical state machines, ScriptableObject configuration, save-system abstraction, Addressables and SDK abstraction.</w:t>
       </w:r>
@@ -659,24 +1100,38 @@
           <w:numId w:val="2"/>
         </w:numPr>
         <w:spacing w:after="10"/>
-      </w:pPr>
-      <w:r>
-        <w:rPr>
-          <w:color w:val="1A1A1A"/>
+        <w:rPr>
+          <w:rFonts w:ascii="Arial" w:hAnsi="Arial" w:cs="Arial"/>
+          <w:sz w:val="20"/>
+          <w:szCs w:val="20"/>
+        </w:rPr>
+      </w:pPr>
+      <w:r>
+        <w:rPr>
+          <w:rFonts w:ascii="Arial" w:hAnsi="Arial" w:cs="Arial"/>
+          <w:color w:val="1A1A1A"/>
+          <w:sz w:val="20"/>
+          <w:szCs w:val="20"/>
         </w:rPr>
         <w:t xml:space="preserve">Built </w:t>
       </w:r>
       <w:r>
         <w:rPr>
+          <w:rFonts w:ascii="Arial" w:hAnsi="Arial" w:cs="Arial"/>
           <w:b/>
           <w:bCs/>
           <w:color w:val="1A1A1A"/>
+          <w:sz w:val="20"/>
+          <w:szCs w:val="20"/>
         </w:rPr>
         <w:t>Unity Editor tooling</w:t>
       </w:r>
       <w:r>
         <w:rPr>
-          <w:color w:val="1A1A1A"/>
+          <w:rFonts w:ascii="Arial" w:hAnsi="Arial" w:cs="Arial"/>
+          <w:color w:val="1A1A1A"/>
+          <w:sz w:val="20"/>
+          <w:szCs w:val="20"/>
         </w:rPr>
         <w:t xml:space="preserve"> for asset import, ScriptableObject authoring and pre-build validation, reducing content setup time and preventing recurring release issues.</w:t>
       </w:r>
@@ -689,29 +1144,92 @@
           <w:numId w:val="2"/>
         </w:numPr>
         <w:spacing w:after="10"/>
-      </w:pPr>
-      <w:r>
-        <w:rPr>
-          <w:color w:val="1A1A1A"/>
+        <w:rPr>
+          <w:rFonts w:ascii="Arial" w:hAnsi="Arial" w:cs="Arial"/>
+          <w:sz w:val="20"/>
+          <w:szCs w:val="20"/>
+        </w:rPr>
+      </w:pPr>
+      <w:r>
+        <w:rPr>
+          <w:rFonts w:ascii="Arial" w:hAnsi="Arial" w:cs="Arial"/>
+          <w:color w:val="1A1A1A"/>
+          <w:sz w:val="20"/>
+          <w:szCs w:val="20"/>
         </w:rPr>
         <w:t>Supported production releases across WebGL and mobile platforms under strict performance, memory and build-size constraints.</w:t>
       </w:r>
     </w:p>
     <w:p>
       <w:pPr>
-        <w:spacing w:before="30" w:after="60"/>
-      </w:pPr>
-      <w:r>
-        <w:rPr>
+        <w:pStyle w:val="ListParagraph"/>
+        <w:numPr>
+          <w:ilvl w:val="0"/>
+          <w:numId w:val="2"/>
+        </w:numPr>
+        <w:spacing w:after="10"/>
+        <w:rPr>
+          <w:rFonts w:ascii="Arial" w:hAnsi="Arial" w:cs="Arial"/>
+          <w:sz w:val="20"/>
+          <w:szCs w:val="20"/>
+        </w:rPr>
+      </w:pPr>
+      <w:r>
+        <w:rPr>
+          <w:rFonts w:ascii="Arial" w:hAnsi="Arial" w:cs="Arial"/>
+          <w:color w:val="1A1A1A"/>
+          <w:sz w:val="20"/>
+          <w:szCs w:val="20"/>
+        </w:rPr>
+        <w:t xml:space="preserve">Optimized environment geometry from </w:t>
+      </w:r>
+      <w:r>
+        <w:rPr>
+          <w:rFonts w:ascii="Arial" w:hAnsi="Arial" w:cs="Arial"/>
           <w:b/>
           <w:bCs/>
           <w:color w:val="1A1A1A"/>
+          <w:sz w:val="20"/>
+          <w:szCs w:val="20"/>
+        </w:rPr>
+        <w:t>~1M to ~40k triangles</w:t>
+      </w:r>
+      <w:r>
+        <w:rPr>
+          <w:rFonts w:ascii="Arial" w:hAnsi="Arial" w:cs="Arial"/>
+          <w:color w:val="1A1A1A"/>
+          <w:sz w:val="20"/>
+          <w:szCs w:val="20"/>
+        </w:rPr>
+        <w:t xml:space="preserve"> on a mobile prototype via mesh decimation, LODs and silhouette-preserving proxies.</w:t>
+      </w:r>
+    </w:p>
+    <w:p>
+      <w:pPr>
+        <w:spacing w:before="30" w:after="60"/>
+        <w:rPr>
+          <w:rFonts w:ascii="Arial" w:hAnsi="Arial" w:cs="Arial"/>
+          <w:sz w:val="20"/>
+          <w:szCs w:val="20"/>
+        </w:rPr>
+      </w:pPr>
+      <w:r>
+        <w:rPr>
+          <w:rFonts w:ascii="Arial" w:hAnsi="Arial" w:cs="Arial"/>
+          <w:b/>
+          <w:bCs/>
+          <w:color w:val="1A1A1A"/>
+          <w:sz w:val="20"/>
+          <w:szCs w:val="20"/>
         </w:rPr>
         <w:t xml:space="preserve">Tech: </w:t>
       </w:r>
       <w:r>
         <w:rPr>
-          <w:color w:val="1A1A1A"/>
+          <w:rFonts w:ascii="Arial" w:hAnsi="Arial" w:cs="Arial"/>
+          <w:color w:val="1A1A1A"/>
+          <w:sz w:val="20"/>
+          <w:szCs w:val="20"/>
         </w:rPr>
         <w:t>Unity, C#, Zenject, UniRx, UniTask, Addressables, WebGL/mobile profiling, editor tooling.</w:t>
       </w:r>
@@ -723,19 +1241,23 @@
         </w:pBdr>
         <w:spacing w:before="140" w:after="60"/>
         <w:rPr>
+          <w:rFonts w:ascii="Arial" w:hAnsi="Arial" w:cs="Arial"/>
+          <w:sz w:val="22"/>
+          <w:szCs w:val="22"/>
           <w:lang w:val="ru-RU"/>
         </w:rPr>
       </w:pPr>
       <w:r>
         <w:rPr>
+          <w:rFonts w:ascii="Arial" w:hAnsi="Arial" w:cs="Arial"/>
           <w:b/>
           <w:bCs/>
           <w:color w:val="1F4E79"/>
           <w:spacing w:val="20"/>
-          <w:sz w:val="21"/>
-          <w:szCs w:val="21"/>
-        </w:rPr>
-        <w:t>CORE STACK</w:t>
+          <w:sz w:val="22"/>
+          <w:szCs w:val="22"/>
+        </w:rPr>
+        <w:t>TECHNICAL SKILLS</w:t>
       </w:r>
     </w:p>
     <w:p>
@@ -746,11 +1268,29 @@
           <w:numId w:val="4"/>
         </w:numPr>
         <w:rPr>
+          <w:rFonts w:ascii="Arial" w:hAnsi="Arial" w:cs="Arial"/>
+          <w:sz w:val="20"/>
+          <w:szCs w:val="20"/>
           <w:lang w:val="en-US"/>
         </w:rPr>
       </w:pPr>
       <w:r>
-        <w:t>Engine &amp; Languages: C#, Unity, URP</w:t>
+        <w:rPr>
+          <w:rFonts w:ascii="Arial" w:hAnsi="Arial" w:cs="Arial"/>
+          <w:b/>
+          <w:bCs/>
+          <w:sz w:val="20"/>
+          <w:szCs w:val="20"/>
+        </w:rPr>
+        <w:t>Engine &amp; Languages:</w:t>
+      </w:r>
+      <w:r>
+        <w:rPr>
+          <w:rFonts w:ascii="Arial" w:hAnsi="Arial" w:cs="Arial"/>
+          <w:sz w:val="20"/>
+          <w:szCs w:val="20"/>
+        </w:rPr>
+        <w:t xml:space="preserve"> C#, Unity, URP</w:t>
       </w:r>
     </w:p>
     <w:p>
@@ -761,11 +1301,29 @@
           <w:numId w:val="4"/>
         </w:numPr>
         <w:rPr>
+          <w:rFonts w:ascii="Arial" w:hAnsi="Arial" w:cs="Arial"/>
+          <w:sz w:val="20"/>
+          <w:szCs w:val="20"/>
           <w:lang w:val="en-US"/>
         </w:rPr>
       </w:pPr>
       <w:r>
-        <w:t>Architecture: SOLID, dependency injection, Zenject, lightweight custom context layer, hierarchical state machines, ScriptableObject-driven configuration, reactive event systems, save-system abstraction</w:t>
+        <w:rPr>
+          <w:rFonts w:ascii="Arial" w:hAnsi="Arial" w:cs="Arial"/>
+          <w:b/>
+          <w:bCs/>
+          <w:sz w:val="20"/>
+          <w:szCs w:val="20"/>
+        </w:rPr>
+        <w:t>Architecture:</w:t>
+      </w:r>
+      <w:r>
+        <w:rPr>
+          <w:rFonts w:ascii="Arial" w:hAnsi="Arial" w:cs="Arial"/>
+          <w:sz w:val="20"/>
+          <w:szCs w:val="20"/>
+        </w:rPr>
+        <w:t xml:space="preserve"> SOLID, dependency injection, Zenject, lightweight custom context layer, hierarchical state machines, ScriptableObject-driven configuration, reactive event systems, save-system abstraction</w:t>
       </w:r>
     </w:p>
     <w:p>
@@ -775,9 +1333,29 @@
           <w:ilvl w:val="0"/>
           <w:numId w:val="4"/>
         </w:numPr>
-      </w:pPr>
-      <w:r>
-        <w:t>Rendering: custom URP render features and passes, image-effect composition, X-ray-style visualization, WebGL shader budgeting, ShaderVariantCollection management</w:t>
+        <w:rPr>
+          <w:rFonts w:ascii="Arial" w:hAnsi="Arial" w:cs="Arial"/>
+          <w:sz w:val="20"/>
+          <w:szCs w:val="20"/>
+        </w:rPr>
+      </w:pPr>
+      <w:r>
+        <w:rPr>
+          <w:rFonts w:ascii="Arial" w:hAnsi="Arial" w:cs="Arial"/>
+          <w:b/>
+          <w:bCs/>
+          <w:sz w:val="20"/>
+          <w:szCs w:val="20"/>
+        </w:rPr>
+        <w:t>Rendering:</w:t>
+      </w:r>
+      <w:r>
+        <w:rPr>
+          <w:rFonts w:ascii="Arial" w:hAnsi="Arial" w:cs="Arial"/>
+          <w:sz w:val="20"/>
+          <w:szCs w:val="20"/>
+        </w:rPr>
+        <w:t xml:space="preserve"> custom URP render features and passes, image-effect composition, X-ray-style visualization, WebGL shader budgeting, ShaderVariantCollection management</w:t>
       </w:r>
     </w:p>
     <w:p>
@@ -788,11 +1366,29 @@
           <w:numId w:val="4"/>
         </w:numPr>
         <w:rPr>
+          <w:rFonts w:ascii="Arial" w:hAnsi="Arial" w:cs="Arial"/>
+          <w:sz w:val="20"/>
+          <w:szCs w:val="20"/>
           <w:lang w:val="en-US"/>
         </w:rPr>
       </w:pPr>
       <w:r>
-        <w:t>Physics &amp; Simulation: ConfigurableJoints, guidewire/catheter simulation, multi-rigidbody systems, procedural meshes, blendshape-driven deformation</w:t>
+        <w:rPr>
+          <w:rFonts w:ascii="Arial" w:hAnsi="Arial" w:cs="Arial"/>
+          <w:b/>
+          <w:bCs/>
+          <w:sz w:val="20"/>
+          <w:szCs w:val="20"/>
+        </w:rPr>
+        <w:t>Physics &amp; Simulation:</w:t>
+      </w:r>
+      <w:r>
+        <w:rPr>
+          <w:rFonts w:ascii="Arial" w:hAnsi="Arial" w:cs="Arial"/>
+          <w:sz w:val="20"/>
+          <w:szCs w:val="20"/>
+        </w:rPr>
+        <w:t xml:space="preserve"> ConfigurableJoints, guidewire/catheter simulation, multi-rigidbody systems, procedural meshes, blendshape-driven deformation</w:t>
       </w:r>
     </w:p>
     <w:p>
@@ -803,11 +1399,29 @@
           <w:numId w:val="4"/>
         </w:numPr>
         <w:rPr>
+          <w:rFonts w:ascii="Arial" w:hAnsi="Arial" w:cs="Arial"/>
+          <w:sz w:val="20"/>
+          <w:szCs w:val="20"/>
           <w:lang w:val="en-US"/>
         </w:rPr>
       </w:pPr>
       <w:r>
-        <w:t>Performance: Unity Profiler, Memory Profiler, GC allocation reduction, draw-call analysis and batching, WebGL build-size optimization, low-end Android profiling</w:t>
+        <w:rPr>
+          <w:rFonts w:ascii="Arial" w:hAnsi="Arial" w:cs="Arial"/>
+          <w:b/>
+          <w:bCs/>
+          <w:sz w:val="20"/>
+          <w:szCs w:val="20"/>
+        </w:rPr>
+        <w:t>Performance:</w:t>
+      </w:r>
+      <w:r>
+        <w:rPr>
+          <w:rFonts w:ascii="Arial" w:hAnsi="Arial" w:cs="Arial"/>
+          <w:sz w:val="20"/>
+          <w:szCs w:val="20"/>
+        </w:rPr>
+        <w:t xml:space="preserve"> Unity Profiler, Memory Profiler, GC allocation reduction, draw-call analysis and batching, WebGL build-size optimization, low-end Android profiling</w:t>
       </w:r>
     </w:p>
     <w:p>
@@ -818,11 +1432,29 @@
           <w:numId w:val="4"/>
         </w:numPr>
         <w:rPr>
+          <w:rFonts w:ascii="Arial" w:hAnsi="Arial" w:cs="Arial"/>
+          <w:sz w:val="20"/>
+          <w:szCs w:val="20"/>
           <w:lang w:val="en-US"/>
         </w:rPr>
       </w:pPr>
       <w:r>
-        <w:t>Production Tooling: Addressables, editor tooling, content pipelines, build pipelines, pre-build validation, Git, code review, mentoring</w:t>
+        <w:rPr>
+          <w:rFonts w:ascii="Arial" w:hAnsi="Arial" w:cs="Arial"/>
+          <w:b/>
+          <w:bCs/>
+          <w:sz w:val="20"/>
+          <w:szCs w:val="20"/>
+        </w:rPr>
+        <w:t>Production Tooling:</w:t>
+      </w:r>
+      <w:r>
+        <w:rPr>
+          <w:rFonts w:ascii="Arial" w:hAnsi="Arial" w:cs="Arial"/>
+          <w:sz w:val="20"/>
+          <w:szCs w:val="20"/>
+        </w:rPr>
+        <w:t xml:space="preserve"> Addressables, editor tooling, content pipelines, build pipelines, pre-build validation, Git, code review, mentoring</w:t>
       </w:r>
     </w:p>
     <w:p>
@@ -832,82 +1464,165 @@
         </w:pBdr>
         <w:spacing w:before="140" w:after="60"/>
         <w:rPr>
+          <w:rFonts w:ascii="Arial" w:hAnsi="Arial" w:cs="Arial"/>
           <w:b/>
           <w:bCs/>
           <w:color w:val="1A1A1A"/>
+          <w:sz w:val="22"/>
+          <w:szCs w:val="22"/>
           <w:lang w:val="en-US"/>
         </w:rPr>
       </w:pPr>
       <w:r>
         <w:rPr>
+          <w:rFonts w:ascii="Arial" w:hAnsi="Arial" w:cs="Arial"/>
           <w:b/>
           <w:bCs/>
           <w:color w:val="1F4E79"/>
           <w:spacing w:val="20"/>
-          <w:sz w:val="21"/>
-          <w:szCs w:val="21"/>
+          <w:sz w:val="22"/>
+          <w:szCs w:val="22"/>
         </w:rPr>
         <w:t>EDUCATION</w:t>
       </w:r>
     </w:p>
     <w:p>
       <w:pPr>
-        <w:spacing w:after="10"/>
-      </w:pPr>
-      <w:r>
-        <w:rPr>
+        <w:keepNext/>
+        <w:tabs>
+          <w:tab w:val="right" w:pos="10106"/>
+        </w:tabs>
+        <w:rPr>
+          <w:rFonts w:ascii="Arial" w:hAnsi="Arial" w:cs="Arial"/>
+          <w:sz w:val="20"/>
+          <w:szCs w:val="20"/>
+        </w:rPr>
+      </w:pPr>
+      <w:r>
+        <w:rPr>
+          <w:rFonts w:ascii="Arial" w:hAnsi="Arial" w:cs="Arial"/>
           <w:b/>
           <w:bCs/>
           <w:color w:val="1A1A1A"/>
+          <w:sz w:val="20"/>
+          <w:szCs w:val="20"/>
+        </w:rPr>
+        <w:t>Università Cattolica del Sacro Cuore</w:t>
+      </w:r>
+      <w:r>
+        <w:tab/>
+      </w:r>
+      <w:r>
+        <w:rPr>
+          <w:rFonts w:ascii="Arial" w:hAnsi="Arial" w:cs="Arial"/>
+          <w:color w:val="555555"/>
+          <w:sz w:val="20"/>
+          <w:szCs w:val="20"/>
+        </w:rPr>
+        <w:t>Milan, Italy</w:t>
+      </w:r>
+    </w:p>
+    <w:p>
+      <w:pPr>
+        <w:tabs>
+          <w:tab w:val="right" w:pos="10106"/>
+        </w:tabs>
+        <w:spacing w:after="10"/>
+        <w:rPr>
+          <w:rFonts w:ascii="Arial" w:hAnsi="Arial" w:cs="Arial"/>
+          <w:sz w:val="20"/>
+          <w:szCs w:val="20"/>
+        </w:rPr>
+      </w:pPr>
+      <w:r>
+        <w:rPr>
+          <w:rFonts w:ascii="Arial" w:hAnsi="Arial" w:cs="Arial"/>
+          <w:color w:val="1A1A1A"/>
+          <w:sz w:val="20"/>
+          <w:szCs w:val="20"/>
         </w:rPr>
         <w:t>BSc Economics &amp; Management</w:t>
       </w:r>
       <w:r>
-        <w:rPr>
-          <w:color w:val="1A1A1A"/>
-        </w:rPr>
-        <w:t xml:space="preserve"> — Università Cattolica del Sacro Cuore, Milan</w:t>
-      </w:r>
-      <w:r>
-        <w:rPr>
-          <w:i/>
-          <w:iCs/>
+        <w:tab/>
+      </w:r>
+      <w:r>
+        <w:rPr>
+          <w:rFonts w:ascii="Arial" w:hAnsi="Arial" w:cs="Arial"/>
           <w:color w:val="555555"/>
-        </w:rPr>
-        <w:t xml:space="preserve">    2024 – Present</w:t>
-      </w:r>
-    </w:p>
-    <w:p>
-      <w:r>
-        <w:rPr>
+          <w:sz w:val="20"/>
+          <w:szCs w:val="20"/>
+        </w:rPr>
+        <w:t>2024 – Present</w:t>
+      </w:r>
+    </w:p>
+    <w:p>
+      <w:pPr>
+        <w:keepNext/>
+        <w:tabs>
+          <w:tab w:val="right" w:pos="10106"/>
+        </w:tabs>
+        <w:rPr>
+          <w:rFonts w:ascii="Arial" w:hAnsi="Arial" w:cs="Arial"/>
+          <w:sz w:val="20"/>
+          <w:szCs w:val="20"/>
+        </w:rPr>
+      </w:pPr>
+      <w:r>
+        <w:rPr>
+          <w:rFonts w:ascii="Arial" w:hAnsi="Arial" w:cs="Arial"/>
           <w:b/>
           <w:bCs/>
           <w:color w:val="1A1A1A"/>
+          <w:sz w:val="20"/>
+          <w:szCs w:val="20"/>
+        </w:rPr>
+        <w:t>Ufa State Petroleum Tech. University</w:t>
+      </w:r>
+      <w:r>
+        <w:tab/>
+      </w:r>
+      <w:r>
+        <w:rPr>
+          <w:rFonts w:ascii="Arial" w:hAnsi="Arial" w:cs="Arial"/>
+          <w:color w:val="555555"/>
+          <w:sz w:val="20"/>
+          <w:szCs w:val="20"/>
+        </w:rPr>
+        <w:t>Ufa, Russia</w:t>
+      </w:r>
+    </w:p>
+    <w:p>
+      <w:pPr>
+        <w:tabs>
+          <w:tab w:val="right" w:pos="10106"/>
+        </w:tabs>
+        <w:rPr>
+          <w:rFonts w:ascii="Arial" w:hAnsi="Arial" w:cs="Arial"/>
+          <w:sz w:val="20"/>
+          <w:szCs w:val="20"/>
+        </w:rPr>
+      </w:pPr>
+      <w:r>
+        <w:rPr>
+          <w:rFonts w:ascii="Arial" w:hAnsi="Arial" w:cs="Arial"/>
+          <w:color w:val="1A1A1A"/>
+          <w:sz w:val="20"/>
+          <w:szCs w:val="20"/>
         </w:rPr>
         <w:t>Automation &amp; Control Systems</w:t>
       </w:r>
       <w:r>
-        <w:rPr>
-          <w:b/>
-          <w:bCs/>
-          <w:color w:val="1A1A1A"/>
-          <w:lang w:val="en-US"/>
-        </w:rPr>
-        <w:t xml:space="preserve"> </w:t>
-      </w:r>
-      <w:r>
-        <w:rPr>
-          <w:color w:val="1A1A1A"/>
-        </w:rPr>
-        <w:t>— Ufa State Petroleum Tech. University</w:t>
-      </w:r>
-      <w:r>
-        <w:rPr>
-          <w:i/>
-          <w:iCs/>
+        <w:tab/>
+      </w:r>
+      <w:r>
+        <w:rPr>
+          <w:rFonts w:ascii="Arial" w:hAnsi="Arial" w:cs="Arial"/>
           <w:color w:val="555555"/>
-        </w:rPr>
-        <w:t xml:space="preserve">    2022 – 2024</w:t>
+          <w:sz w:val="20"/>
+          <w:szCs w:val="20"/>
+        </w:rPr>
+        <w:t>2022 – 2024</w:t>
       </w:r>
     </w:p>
     <w:sectPr>
@@ -920,7 +1635,66 @@
 </w:document>
 </file>
 
-<file path=word/numbering.xml><?xml version="1.0" encoding="utf-8"?>
+<file path=word\fontTable.xml><?xml version="1.0" encoding="utf-8"?>
+<w:fonts xmlns:mc="http://schemas.openxmlformats.org/markup-compatibility/2006" xmlns:r="http://schemas.openxmlformats.org/officeDocument/2006/relationships" xmlns:w="http://schemas.openxmlformats.org/wordprocessingml/2006/main" xmlns:w14="http://schemas.microsoft.com/office/word/2010/wordml" xmlns:w15="http://schemas.microsoft.com/office/word/2012/wordml" xmlns:w16cex="http://schemas.microsoft.com/office/word/2018/wordml/cex" xmlns:w16cid="http://schemas.microsoft.com/office/word/2016/wordml/cid" xmlns:w16="http://schemas.microsoft.com/office/word/2018/wordml" xmlns:w16du="http://schemas.microsoft.com/office/word/2023/wordml/word16du" xmlns:w16sdtdh="http://schemas.microsoft.com/office/word/2020/wordml/sdtdatahash" xmlns:w16sdtfl="http://schemas.microsoft.com/office/word/2024/wordml/sdtformatlock" xmlns:w16se="http://schemas.microsoft.com/office/word/2015/wordml/symex" mc:Ignorable="w14 w15 w16se w16cid w16 w16cex w16sdtdh w16sdtfl w16du">
+  <w:font w:name="Symbol">
+    <w:panose1 w:val="05050102010706020507"/>
+    <w:charset w:val="02"/>
+    <w:family w:val="roman"/>
+    <w:pitch w:val="variable"/>
+    <w:sig w:usb0="00000000" w:usb1="10000000" w:usb2="00000000" w:usb3="00000000" w:csb0="80000000" w:csb1="00000000"/>
+  </w:font>
+  <w:font w:name="Times New Roman">
+    <w:panose1 w:val="02020603050405020304"/>
+    <w:charset w:val="00"/>
+    <w:family w:val="roman"/>
+    <w:pitch w:val="variable"/>
+    <w:sig w:usb0="E0002EFF" w:usb1="C000785B" w:usb2="00000009" w:usb3="00000000" w:csb0="000001FF" w:csb1="00000000"/>
+  </w:font>
+  <w:font w:name="Courier New">
+    <w:panose1 w:val="02070309020205020404"/>
+    <w:charset w:val="00"/>
+    <w:family w:val="modern"/>
+    <w:pitch w:val="fixed"/>
+    <w:sig w:usb0="E0002EFF" w:usb1="C0007843" w:usb2="00000009" w:usb3="00000000" w:csb0="000001FF" w:csb1="00000000"/>
+  </w:font>
+  <w:font w:name="Wingdings">
+    <w:panose1 w:val="05000000000000000000"/>
+    <w:charset w:val="02"/>
+    <w:family w:val="auto"/>
+    <w:pitch w:val="variable"/>
+    <w:sig w:usb0="00000000" w:usb1="10000000" w:usb2="00000000" w:usb3="00000000" w:csb0="80000000" w:csb1="00000000"/>
+  </w:font>
+  <w:font w:name="Calibri">
+    <w:panose1 w:val="020F0502020204030204"/>
+    <w:charset w:val="00"/>
+    <w:family w:val="swiss"/>
+    <w:pitch w:val="variable"/>
+    <w:sig w:usb0="E4002EFF" w:usb1="C200247B" w:usb2="00000009" w:usb3="00000000" w:csb0="000001FF" w:csb1="00000000"/>
+  </w:font>
+  <w:font w:name="Arial">
+    <w:panose1 w:val="020B0604020202020204"/>
+    <w:charset w:val="00"/>
+    <w:family w:val="swiss"/>
+    <w:pitch w:val="variable"/>
+    <w:sig w:usb0="E0002EFF" w:usb1="C000785B" w:usb2="00000009" w:usb3="00000000" w:csb0="000001FF" w:csb1="00000000"/>
+  </w:font>
+  <w:font w:name="Aptos Display">
+    <w:charset w:val="00"/>
+    <w:family w:val="swiss"/>
+    <w:pitch w:val="variable"/>
+    <w:sig w:usb0="20000287" w:usb1="00000003" w:usb2="00000000" w:usb3="00000000" w:csb0="0000019F" w:csb1="00000000"/>
+  </w:font>
+  <w:font w:name="Aptos">
+    <w:charset w:val="00"/>
+    <w:family w:val="swiss"/>
+    <w:pitch w:val="variable"/>
+    <w:sig w:usb0="20000287" w:usb1="00000003" w:usb2="00000000" w:usb3="00000000" w:csb0="0000019F" w:csb1="00000000"/>
+  </w:font>
+</w:fonts>
+</file>
+
+<file path=word\numbering.xml><?xml version="1.0" encoding="utf-8"?>
 <w:numbering xmlns:wpc="http://schemas.microsoft.com/office/word/2010/wordprocessingCanvas" xmlns:cx="http://schemas.microsoft.com/office/drawing/2014/chartex" xmlns:cx1="http://schemas.microsoft.com/office/drawing/2015/9/8/chartex" xmlns:cx2="http://schemas.microsoft.com/office/drawing/2015/10/21/chartex" xmlns:cx3="http://schemas.microsoft.com/office/drawing/2016/5/9/chartex" xmlns:cx4="http://schemas.microsoft.com/office/drawing/2016/5/10/chartex" xmlns:cx5="http://schemas.microsoft.com/office/drawing/2016/5/11/chartex" xmlns:cx6="http://schemas.microsoft.com/office/drawing/2016/5/12/chartex" xmlns:cx7="http://schemas.microsoft.com/office/drawing/2016/5/13/chartex" xmlns:cx8="http://schemas.microsoft.com/office/drawing/2016/5/14/chartex" xmlns:mc="http://schemas.openxmlformats.org/markup-compatibility/2006" xmlns:aink="http://schemas.microsoft.com/office/drawing/2016/ink" xmlns:am3d="http://schemas.microsoft.com/office/drawing/2017/model3d" xmlns:o="urn:schemas-microsoft-com:office:office" xmlns:oel="http://schemas.microsoft.com/office/2019/extlst" xmlns:r="http://schemas.openxmlformats.org/officeDocument/2006/relationships" xmlns:m="http://schemas.openxmlformats.org/officeDocument/2006/math" xmlns:v="urn:schemas-microsoft-com:vml" xmlns:wp14="http://schemas.microsoft.com/office/word/2010/wordprocessingDrawing" xmlns:wp="http://schemas.openxmlformats.org/drawingml/2006/wordprocessingDrawing" xmlns:w10="urn:schemas-microsoft-com:office:word" xmlns:w="http://schemas.openxmlformats.org/wordprocessingml/2006/main" xmlns:w14="http://schemas.microsoft.com/office/word/2010/wordml" xmlns:w15="http://schemas.microsoft.com/office/word/2012/wordml" xmlns:w16cex="http://schemas.microsoft.com/office/word/2018/wordml/cex" xmlns:w16cid="http://schemas.microsoft.com/office/word/2016/wordml/cid" xmlns:w16="http://schemas.microsoft.com/office/word/2018/wordml" xmlns:w16du="http://schemas.microsoft.com/office/word/2023/wordml/word16du" xmlns:w16sdtdh="http://schemas.microsoft.com/office/word/2020/wordml/sdtdatahash" xmlns:w16sdtfl="http://schemas.microsoft.com/office/word/2024/wordml/sdtformatlock" xmlns:w16se="http://schemas.microsoft.com/office/word/2015/wordml/symex" xmlns:wpg="http://schemas.microsoft.com/office/word/2010/wordprocessingGroup" xmlns:wpi="http://schemas.microsoft.com/office/word/2010/wordprocessingInk" xmlns:wne="http://schemas.microsoft.com/office/word/2006/wordml" xmlns:wps="http://schemas.microsoft.com/office/word/2010/wordprocessingShape" mc:Ignorable="w14 w15 w16se w16cid w16 w16cex w16sdtdh w16sdtfl w16du wp14">
   <w:abstractNum w:abstractNumId="0" w15:restartNumberingAfterBreak="0">
     <w:nsid w:val="00670FE0"/>
@@ -1309,7 +2083,68 @@
 </w:numbering>
 </file>
 
-<file path=word/styles.xml><?xml version="1.0" encoding="utf-8"?>
+<file path=word\settings.xml><?xml version="1.0" encoding="utf-8"?>
+<w:settings xmlns:mc="http://schemas.openxmlformats.org/markup-compatibility/2006" xmlns:o="urn:schemas-microsoft-com:office:office" xmlns:r="http://schemas.openxmlformats.org/officeDocument/2006/relationships" xmlns:m="http://schemas.openxmlformats.org/officeDocument/2006/math" xmlns:v="urn:schemas-microsoft-com:vml" xmlns:w10="urn:schemas-microsoft-com:office:word" xmlns:w="http://schemas.openxmlformats.org/wordprocessingml/2006/main" xmlns:w14="http://schemas.microsoft.com/office/word/2010/wordml" xmlns:w15="http://schemas.microsoft.com/office/word/2012/wordml" xmlns:w16cex="http://schemas.microsoft.com/office/word/2018/wordml/cex" xmlns:w16cid="http://schemas.microsoft.com/office/word/2016/wordml/cid" xmlns:w16="http://schemas.microsoft.com/office/word/2018/wordml" xmlns:w16du="http://schemas.microsoft.com/office/word/2023/wordml/word16du" xmlns:w16sdtdh="http://schemas.microsoft.com/office/word/2020/wordml/sdtdatahash" xmlns:w16sdtfl="http://schemas.microsoft.com/office/word/2024/wordml/sdtformatlock" xmlns:w16se="http://schemas.microsoft.com/office/word/2015/wordml/symex" xmlns:sl="http://schemas.openxmlformats.org/schemaLibrary/2006/main" mc:Ignorable="w14 w15 w16se w16cid w16 w16cex w16sdtdh w16sdtfl w16du">
+  <w:zoom w:percent="100"/>
+  <w:displayBackgroundShape/>
+  <w:proofState w:spelling="clean" w:grammar="clean"/>
+  <w:defaultTabStop w:val="720"/>
+  <w:characterSpacingControl w:val="doNotCompress"/>
+  <w:compat>
+    <w:compatSetting w:name="compatibilityMode" w:uri="http://schemas.microsoft.com/office/word" w:val="15"/>
+    <w:compatSetting w:name="overrideTableStyleFontSizeAndJustification" w:uri="http://schemas.microsoft.com/office/word" w:val="1"/>
+    <w:compatSetting w:name="enableOpenTypeFeatures" w:uri="http://schemas.microsoft.com/office/word" w:val="1"/>
+    <w:compatSetting w:name="doNotFlipMirrorIndents" w:uri="http://schemas.microsoft.com/office/word" w:val="1"/>
+    <w:compatSetting w:name="differentiateMultirowTableHeaders" w:uri="http://schemas.microsoft.com/office/word" w:val="1"/>
+    <w:compatSetting w:name="useWord2013TrackBottomHyphenation" w:uri="http://schemas.microsoft.com/office/word" w:val="1"/>
+  </w:compat>
+  <w:rsids>
+    <w:rsidRoot w:val="005A067A"/>
+    <w:rsid w:val="000A4134"/>
+    <w:rsid w:val="000D3E23"/>
+    <w:rsid w:val="000D6D00"/>
+    <w:rsid w:val="000F0AFD"/>
+    <w:rsid w:val="001F64FE"/>
+    <w:rsid w:val="0020486C"/>
+    <w:rsid w:val="0027778C"/>
+    <w:rsid w:val="002B75F6"/>
+    <w:rsid w:val="002E2FFE"/>
+    <w:rsid w:val="00317A16"/>
+    <w:rsid w:val="005A067A"/>
+    <w:rsid w:val="008E4358"/>
+    <w:rsid w:val="00927B9C"/>
+    <w:rsid w:val="00AE603D"/>
+    <w:rsid w:val="00FC1587"/>
+  </w:rsids>
+  <m:mathPr>
+    <m:mathFont m:val="Cambria Math"/>
+    <m:brkBin m:val="before"/>
+    <m:brkBinSub m:val="--"/>
+    <m:smallFrac m:val="0"/>
+    <m:dispDef/>
+    <m:lMargin m:val="0"/>
+    <m:rMargin m:val="0"/>
+    <m:defJc m:val="centerGroup"/>
+    <m:wrapIndent m:val="1440"/>
+    <m:intLim m:val="subSup"/>
+    <m:naryLim m:val="undOvr"/>
+  </m:mathPr>
+  <w:themeFontLang/>
+  <w:clrSchemeMapping w:bg1="light1" w:t1="dark1" w:bg2="light2" w:t2="dark2" w:accent1="accent1" w:accent2="accent2" w:accent3="accent3" w:accent4="accent4" w:accent5="accent5" w:accent6="accent6" w:hyperlink="hyperlink" w:followedHyperlink="followedHyperlink"/>
+  <w:shapeDefaults>
+    <o:shapedefaults v:ext="edit" spidmax="1026"/>
+    <o:shapelayout v:ext="edit">
+      <o:idmap v:ext="edit" data="1"/>
+    </o:shapelayout>
+  </w:shapeDefaults>
+  <w:decimalSymbol w:val="."/>
+  <w:listSeparator w:val=","/>
+  <w14:docId w14:val="465B68F2"/>
+  <w15:docId w15:val="{1876F3D3-20E2-4074-B474-21A9E593638D}"/>
+</w:settings>
+</file>
+
+<file path=word\styles.xml><?xml version="1.0" encoding="utf-8"?>
 <w:styles xmlns:mc="http://schemas.openxmlformats.org/markup-compatibility/2006" xmlns:r="http://schemas.openxmlformats.org/officeDocument/2006/relationships" xmlns:w="http://schemas.openxmlformats.org/wordprocessingml/2006/main" xmlns:w14="http://schemas.microsoft.com/office/word/2010/wordml" xmlns:w15="http://schemas.microsoft.com/office/word/2012/wordml" xmlns:w16cex="http://schemas.microsoft.com/office/word/2018/wordml/cex" xmlns:w16cid="http://schemas.microsoft.com/office/word/2016/wordml/cid" xmlns:w16="http://schemas.microsoft.com/office/word/2018/wordml" xmlns:w16du="http://schemas.microsoft.com/office/word/2023/wordml/word16du" xmlns:w16sdtdh="http://schemas.microsoft.com/office/word/2020/wordml/sdtdatahash" xmlns:w16sdtfl="http://schemas.microsoft.com/office/word/2024/wordml/sdtformatlock" xmlns:w16se="http://schemas.microsoft.com/office/word/2015/wordml/symex" mc:Ignorable="w14 w15 w16se w16cid w16 w16cex w16sdtdh w16sdtfl w16du">
   <w:docDefaults>
     <w:rPrDefault>
@@ -1791,6 +2626,7 @@
   <w:style w:type="character" w:default="1" w:styleId="DefaultParagraphFont">
     <w:name w:val="Default Paragraph Font"/>
     <w:uiPriority w:val="1"/>
+    <w:semiHidden/>
     <w:unhideWhenUsed/>
   </w:style>
   <w:style w:type="table" w:default="1" w:styleId="TableNormal">
@@ -1906,10 +2742,34 @@
       <w:szCs w:val="20"/>
     </w:rPr>
   </w:style>
+  <w:style w:type="character" w:styleId="UnresolvedMention">
+    <w:name w:val="Unresolved Mention"/>
+    <w:basedOn w:val="DefaultParagraphFont"/>
+    <w:uiPriority w:val="99"/>
+    <w:semiHidden/>
+    <w:unhideWhenUsed/>
+    <w:rsid w:val="00927B9C"/>
+    <w:rPr>
+      <w:color w:val="605E5C"/>
+      <w:shd w:val="clear" w:color="auto" w:fill="E1DFDD"/>
+    </w:rPr>
+  </w:style>
+  <w:style w:type="character" w:styleId="FollowedHyperlink">
+    <w:name w:val="FollowedHyperlink"/>
+    <w:basedOn w:val="DefaultParagraphFont"/>
+    <w:uiPriority w:val="99"/>
+    <w:semiHidden/>
+    <w:unhideWhenUsed/>
+    <w:rsid w:val="000A4134"/>
+    <w:rPr>
+      <w:color w:val="96607D" w:themeColor="followedHyperlink"/>
+      <w:u w:val="single"/>
+    </w:rPr>
+  </w:style>
 </w:styles>
 </file>
 
-<file path=word/theme/theme1.xml><?xml version="1.0" encoding="utf-8"?>
+<file path=word\theme\theme1.xml><?xml version="1.0" encoding="utf-8"?>
 <a:theme xmlns:a="http://schemas.openxmlformats.org/drawingml/2006/main" name="Office Theme">
   <a:themeElements>
     <a:clrScheme name="Office">
@@ -2222,4 +3082,8 @@
     </a:ext>
   </a:extLst>
 </a:theme>
+</file>
+
+<file path=word\webSettings.xml><?xml version="1.0" encoding="utf-8"?>
+<w:webSettings xmlns:mc="http://schemas.openxmlformats.org/markup-compatibility/2006" xmlns:r="http://schemas.openxmlformats.org/officeDocument/2006/relationships" xmlns:w="http://schemas.openxmlformats.org/wordprocessingml/2006/main" xmlns:w14="http://schemas.microsoft.com/office/word/2010/wordml" xmlns:w15="http://schemas.microsoft.com/office/word/2012/wordml" xmlns:w16cex="http://schemas.microsoft.com/office/word/2018/wordml/cex" xmlns:w16cid="http://schemas.microsoft.com/office/word/2016/wordml/cid" xmlns:w16="http://schemas.microsoft.com/office/word/2018/wordml" xmlns:w16du="http://schemas.microsoft.com/office/word/2023/wordml/word16du" xmlns:w16sdtdh="http://schemas.microsoft.com/office/word/2020/wordml/sdtdatahash" xmlns:w16sdtfl="http://schemas.microsoft.com/office/word/2024/wordml/sdtformatlock" xmlns:w16se="http://schemas.microsoft.com/office/word/2015/wordml/symex" mc:Ignorable="w14 w15 w16se w16cid w16 w16cex w16sdtdh w16sdtfl w16du"/>
 </file>
</xml_diff>

<commit_message>
Refresh main page (Simulation Engineer) + lead with 40k DAU peak
Main page (index.html, cv.html, Simulation_v2_ATS.docx) gets the same
factual corrections as the Unity Developer variant: VContainer + custom
service locator (was Zenject — wrong everywhere), R3 added, Cinemachine 3
and Animation Rigging in Rendering, custom Rigidbody vehicle controller in
Physics, new Platform SDKs and Analytics skill rows, Unity Localization in
Production, Code Review removed (couldn't confirm). Angio-specific claims
(Custom URP Render Features, X-Ray Visualization, ShaderVariantCollection,
guidewire/catheter simulation) stay — legitimate Angio context.

Both versions now lead with Mega Ramp's 40k DAU peak (was misframed as
9-titles-at-5-10k-DAU, which buried the strongest signal). Aviana
experience refreshed across all surfaces with six repo-evidence-backed
bullets. Multi-game WebGL Portfolio added as a 5th project on main
(stays as the 4th on the variant).
</commit_message>
<xml_diff>
--- a/Iusup_Abduliaparov_CV_Simulation_v2_ATS.docx
+++ b/Iusup_Abduliaparov_CV_Simulation_v2_ATS.docx
@@ -1,51 +1,5 @@
 
-<file path=docProps\app.xml><?xml version="1.0" encoding="utf-8"?>
-<Properties xmlns="http://schemas.openxmlformats.org/officeDocument/2006/extended-properties" xmlns:vt="http://schemas.openxmlformats.org/officeDocument/2006/docPropsVTypes">
-  <Template>Normal.dotm</Template>
-  <TotalTime>49</TotalTime>
-  <Pages>1</Pages>
-  <Words>659</Words>
-  <Characters>3757</Characters>
-  <Application>Microsoft Office Word</Application>
-  <DocSecurity>0</DocSecurity>
-  <Lines>31</Lines>
-  <Paragraphs>8</Paragraphs>
-  <ScaleCrop>false</ScaleCrop>
-  <HeadingPairs>
-    <vt:vector size="2" baseType="variant">
-      <vt:variant>
-        <vt:lpstr>Title</vt:lpstr>
-      </vt:variant>
-      <vt:variant>
-        <vt:i4>1</vt:i4>
-      </vt:variant>
-    </vt:vector>
-  </HeadingPairs>
-  <TitlesOfParts>
-    <vt:vector size="1" baseType="lpstr">
-      <vt:lpstr/>
-    </vt:vector>
-  </TitlesOfParts>
-  <Company/>
-  <LinksUpToDate>false</LinksUpToDate>
-  <CharactersWithSpaces>4408</CharactersWithSpaces>
-  <SharedDoc>false</SharedDoc>
-  <HyperlinksChanged>false</HyperlinksChanged>
-  <AppVersion>16.0000</AppVersion>
-</Properties>
-</file>
-
-<file path=docProps\core.xml><?xml version="1.0" encoding="utf-8"?>
-<cp:coreProperties xmlns:cp="http://schemas.openxmlformats.org/package/2006/metadata/core-properties" xmlns:dc="http://purl.org/dc/elements/1.1/" xmlns:dcterms="http://purl.org/dc/terms/" xmlns:dcmitype="http://purl.org/dc/dcmitype/" xmlns:xsi="http://www.w3.org/2001/XMLSchema-instance">
-  <dc:creator>Iusup Abduliaparov</dc:creator>
-  <cp:lastModifiedBy>Yusup Abdulyaparov</cp:lastModifiedBy>
-  <cp:revision>7</cp:revision>
-  <dcterms:created xsi:type="dcterms:W3CDTF">2026-05-03T18:37:00Z</dcterms:created>
-  <dcterms:modified xsi:type="dcterms:W3CDTF">2026-05-06T00:03:00Z</dcterms:modified>
-</cp:coreProperties>
-</file>
-
-<file path=word\document.xml><?xml version="1.0" encoding="utf-8"?>
+<file path=word/document.xml><?xml version="1.0" encoding="utf-8"?>
 <w:document xmlns:wpc="http://schemas.microsoft.com/office/word/2010/wordprocessingCanvas" xmlns:cx="http://schemas.microsoft.com/office/drawing/2014/chartex" xmlns:cx1="http://schemas.microsoft.com/office/drawing/2015/9/8/chartex" xmlns:cx2="http://schemas.microsoft.com/office/drawing/2015/10/21/chartex" xmlns:cx3="http://schemas.microsoft.com/office/drawing/2016/5/9/chartex" xmlns:cx4="http://schemas.microsoft.com/office/drawing/2016/5/10/chartex" xmlns:cx5="http://schemas.microsoft.com/office/drawing/2016/5/11/chartex" xmlns:cx6="http://schemas.microsoft.com/office/drawing/2016/5/12/chartex" xmlns:cx7="http://schemas.microsoft.com/office/drawing/2016/5/13/chartex" xmlns:cx8="http://schemas.microsoft.com/office/drawing/2016/5/14/chartex" xmlns:mc="http://schemas.openxmlformats.org/markup-compatibility/2006" xmlns:aink="http://schemas.microsoft.com/office/drawing/2016/ink" xmlns:am3d="http://schemas.microsoft.com/office/drawing/2017/model3d" xmlns:o="urn:schemas-microsoft-com:office:office" xmlns:oel="http://schemas.microsoft.com/office/2019/extlst" xmlns:r="http://schemas.openxmlformats.org/officeDocument/2006/relationships" xmlns:m="http://schemas.openxmlformats.org/officeDocument/2006/math" xmlns:v="urn:schemas-microsoft-com:vml" xmlns:wp14="http://schemas.microsoft.com/office/word/2010/wordprocessingDrawing" xmlns:wp="http://schemas.openxmlformats.org/drawingml/2006/wordprocessingDrawing" xmlns:w10="urn:schemas-microsoft-com:office:word" xmlns:w="http://schemas.openxmlformats.org/wordprocessingml/2006/main" xmlns:w14="http://schemas.microsoft.com/office/word/2010/wordml" xmlns:w15="http://schemas.microsoft.com/office/word/2012/wordml" xmlns:w16cex="http://schemas.microsoft.com/office/word/2018/wordml/cex" xmlns:w16cid="http://schemas.microsoft.com/office/word/2016/wordml/cid" xmlns:w16="http://schemas.microsoft.com/office/word/2018/wordml" xmlns:w16du="http://schemas.microsoft.com/office/word/2023/wordml/word16du" xmlns:w16sdtdh="http://schemas.microsoft.com/office/word/2020/wordml/sdtdatahash" xmlns:w16sdtfl="http://schemas.microsoft.com/office/word/2024/wordml/sdtformatlock" xmlns:w16se="http://schemas.microsoft.com/office/word/2015/wordml/symex" xmlns:wpg="http://schemas.microsoft.com/office/word/2010/wordprocessingGroup" xmlns:wpi="http://schemas.microsoft.com/office/word/2010/wordprocessingInk" xmlns:wne="http://schemas.microsoft.com/office/word/2006/wordml" xmlns:wps="http://schemas.microsoft.com/office/word/2010/wordprocessingShape" mc:Ignorable="w14 w15 w16se w16cid w16 w16cex w16sdtdh w16sdtfl w16du wp14">
   <w:body>
     <w:p>
@@ -339,7 +293,7 @@
           <w:sz w:val="20"/>
           <w:szCs w:val="20"/>
         </w:rPr>
-        <w:t>product with 9M+ users.</w:t>
+        <w:t>product reaching 9M+ users at 40k DAU peak, plus nine standalone WebGL titles built on a shared codebase.</w:t>
       </w:r>
     </w:p>
     <w:p>
@@ -938,7 +892,7 @@
           <w:sz w:val="20"/>
           <w:szCs w:val="20"/>
         </w:rPr>
-        <w:t>Owned Unity engineering for high-traffic WebGL and Android real-time applications, focusing on architecture, runtime performance, build size, release stability and production tooling.</w:t>
+        <w:t>Owned Unity engineering for a high-traffic Unity WebGL product reaching 9M+ users at 40k DAU peak, plus nine standalone WebGL titles built on a shared codebase.</w:t>
       </w:r>
     </w:p>
     <w:p>
@@ -962,46 +916,7 @@
           <w:sz w:val="20"/>
           <w:szCs w:val="20"/>
         </w:rPr>
-        <w:t xml:space="preserve">Reduced WebGL build size from </w:t>
-      </w:r>
-      <w:r>
-        <w:rPr>
-          <w:rFonts w:ascii="Arial" w:hAnsi="Arial" w:cs="Arial"/>
-          <w:b/>
-          <w:bCs/>
-          <w:color w:val="1A1A1A"/>
-          <w:sz w:val="20"/>
-          <w:szCs w:val="20"/>
-        </w:rPr>
-        <w:t>100 MB to 20 MB</w:t>
-      </w:r>
-      <w:r>
-        <w:rPr>
-          <w:rFonts w:ascii="Arial" w:hAnsi="Arial" w:cs="Arial"/>
-          <w:color w:val="1A1A1A"/>
-          <w:sz w:val="20"/>
-          <w:szCs w:val="20"/>
-        </w:rPr>
-        <w:t xml:space="preserve"> through shader variant scoping, asset stripping and texture</w:t>
-      </w:r>
-      <w:r>
-        <w:rPr>
-          <w:rFonts w:ascii="Arial" w:hAnsi="Arial" w:cs="Arial"/>
-          <w:color w:val="1A1A1A"/>
-          <w:sz w:val="20"/>
-          <w:szCs w:val="20"/>
-          <w:lang w:val="en-US"/>
-        </w:rPr>
-        <w:t xml:space="preserve"> </w:t>
-      </w:r>
-      <w:r>
-        <w:rPr>
-          <w:rFonts w:ascii="Arial" w:hAnsi="Arial" w:cs="Arial"/>
-          <w:color w:val="1A1A1A"/>
-          <w:sz w:val="20"/>
-          <w:szCs w:val="20"/>
-        </w:rPr>
-        <w:t>audio re-encoding, improving accessibility for low-bandwidth browser users.</w:t>
+        <w:t>Built and maintained a shared Unity codebase shipping nine standalone WebGL titles (Find the Brainrots, Plane Builder, Plus-One Jump, Plus-One Run, Slimes, Build Island and others) from per-game feature branches; reusable services, state machine and save layer across all of them.</w:t>
       </w:r>
     </w:p>
     <w:p>
@@ -1025,27 +940,7 @@
           <w:sz w:val="20"/>
           <w:szCs w:val="20"/>
         </w:rPr>
-        <w:t xml:space="preserve">Improved low-end Android performance from </w:t>
-      </w:r>
-      <w:r>
-        <w:rPr>
-          <w:rFonts w:ascii="Arial" w:hAnsi="Arial" w:cs="Arial"/>
-          <w:b/>
-          <w:bCs/>
-          <w:color w:val="1A1A1A"/>
-          <w:sz w:val="20"/>
-          <w:szCs w:val="20"/>
-        </w:rPr>
-        <w:t>~15 FPS to stable 60 FPS</w:t>
-      </w:r>
-      <w:r>
-        <w:rPr>
-          <w:rFonts w:ascii="Arial" w:hAnsi="Arial" w:cs="Arial"/>
-          <w:color w:val="1A1A1A"/>
-          <w:sz w:val="20"/>
-          <w:szCs w:val="20"/>
-        </w:rPr>
-        <w:t xml:space="preserve"> through GC allocation reduction, pooling, batching, physics-step tuning and profiler-driven optimization.</w:t>
+        <w:t>Reduced WebGL build size from 100 MB to 20 MB through shader-variant scoping, asset stripping and texture/audio re-encoding; improved low-end Android from ~15 FPS to stable 60 FPS via GC allocation reduction, pooling, batching and profiler-driven optimization; eliminated mobile-browser page reloads using on-demand Resources.Load with explicit UnloadUnusedAssets / GC.Collect between scene transitions.</w:t>
       </w:r>
     </w:p>
     <w:p>
@@ -1069,27 +964,7 @@
           <w:sz w:val="20"/>
           <w:szCs w:val="20"/>
         </w:rPr>
-        <w:t xml:space="preserve">Designed a </w:t>
-      </w:r>
-      <w:r>
-        <w:rPr>
-          <w:rFonts w:ascii="Arial" w:hAnsi="Arial" w:cs="Arial"/>
-          <w:b/>
-          <w:bCs/>
-          <w:color w:val="1A1A1A"/>
-          <w:sz w:val="20"/>
-          <w:szCs w:val="20"/>
-        </w:rPr>
-        <w:t>reusable Unity architecture</w:t>
-      </w:r>
-      <w:r>
-        <w:rPr>
-          <w:rFonts w:ascii="Arial" w:hAnsi="Arial" w:cs="Arial"/>
-          <w:color w:val="1A1A1A"/>
-          <w:sz w:val="20"/>
-          <w:szCs w:val="20"/>
-        </w:rPr>
-        <w:t xml:space="preserve"> with DI, hierarchical state machines, ScriptableObject configuration, save-system abstraction, Addressables and SDK abstraction.</w:t>
+        <w:t>Built a 1k-line custom Rigidbody vehicle controller — spring-damper suspension with bump stops and sphere-cast wheel probes, drift, boost, downforce, air control and auto-recovery — refactored from an earlier ConfigurableJoint prototype to stabilize handling for the game's arcade feel.</w:t>
       </w:r>
     </w:p>
     <w:p>
@@ -1113,27 +988,7 @@
           <w:sz w:val="20"/>
           <w:szCs w:val="20"/>
         </w:rPr>
-        <w:t xml:space="preserve">Built </w:t>
-      </w:r>
-      <w:r>
-        <w:rPr>
-          <w:rFonts w:ascii="Arial" w:hAnsi="Arial" w:cs="Arial"/>
-          <w:b/>
-          <w:bCs/>
-          <w:color w:val="1A1A1A"/>
-          <w:sz w:val="20"/>
-          <w:szCs w:val="20"/>
-        </w:rPr>
-        <w:t>Unity Editor tooling</w:t>
-      </w:r>
-      <w:r>
-        <w:rPr>
-          <w:rFonts w:ascii="Arial" w:hAnsi="Arial" w:cs="Arial"/>
-          <w:color w:val="1A1A1A"/>
-          <w:sz w:val="20"/>
-          <w:szCs w:val="20"/>
-        </w:rPr>
-        <w:t xml:space="preserve"> for asset import, ScriptableObject authoring and pre-build validation, reducing content setup time and preventing recurring release issues.</w:t>
+        <w:t>Designed a reusable Unity architecture: DI (VContainer / custom service locator), hierarchical state machines, ScriptableObject configuration and a multi-backend save abstraction (PlayerPrefs / Mirra SDK cloud sync) driving reactive UI through R3 ReactiveProperty.</w:t>
       </w:r>
     </w:p>
     <w:p>
@@ -1157,7 +1012,7 @@
           <w:sz w:val="20"/>
           <w:szCs w:val="20"/>
         </w:rPr>
-        <w:t>Supported production releases across WebGL and mobile platforms under strict performance, memory and build-size constraints.</w:t>
+        <w:t>Integrated production monetization stack — AppLovin MAX with 13 mediation adapters, Unity IAP, Google Play Billing and Play Core in-app updates — and five analytics SDKs (GameAnalytics, AppMetrica, AppsFlyer, ByteBrew, Firebase) behind a single facade.</w:t>
       </w:r>
     </w:p>
     <w:p>
@@ -1181,8 +1036,18 @@
           <w:sz w:val="20"/>
           <w:szCs w:val="20"/>
         </w:rPr>
-        <w:t xml:space="preserve">Optimized environment geometry from </w:t>
-      </w:r>
+        <w:t>Optimized environment geometry from ~1M to ~40k triangles on a mobile prototype via mesh decimation, LODs and silhouette-preserving proxies; supported production releases across WebGL and mobile platforms under strict performance, memory and build-size constraints.</w:t>
+      </w:r>
+    </w:p>
+    <w:p>
+      <w:pPr>
+        <w:spacing w:before="30" w:after="60"/>
+        <w:rPr>
+          <w:rFonts w:ascii="Arial" w:hAnsi="Arial" w:cs="Arial"/>
+          <w:sz w:val="20"/>
+          <w:szCs w:val="20"/>
+        </w:rPr>
+      </w:pPr>
       <w:r>
         <w:rPr>
           <w:rFonts w:ascii="Arial" w:hAnsi="Arial" w:cs="Arial"/>
@@ -1192,36 +1057,6 @@
           <w:sz w:val="20"/>
           <w:szCs w:val="20"/>
         </w:rPr>
-        <w:t>~1M to ~40k triangles</w:t>
-      </w:r>
-      <w:r>
-        <w:rPr>
-          <w:rFonts w:ascii="Arial" w:hAnsi="Arial" w:cs="Arial"/>
-          <w:color w:val="1A1A1A"/>
-          <w:sz w:val="20"/>
-          <w:szCs w:val="20"/>
-        </w:rPr>
-        <w:t xml:space="preserve"> on a mobile prototype via mesh decimation, LODs and silhouette-preserving proxies.</w:t>
-      </w:r>
-    </w:p>
-    <w:p>
-      <w:pPr>
-        <w:spacing w:before="30" w:after="60"/>
-        <w:rPr>
-          <w:rFonts w:ascii="Arial" w:hAnsi="Arial" w:cs="Arial"/>
-          <w:sz w:val="20"/>
-          <w:szCs w:val="20"/>
-        </w:rPr>
-      </w:pPr>
-      <w:r>
-        <w:rPr>
-          <w:rFonts w:ascii="Arial" w:hAnsi="Arial" w:cs="Arial"/>
-          <w:b/>
-          <w:bCs/>
-          <w:color w:val="1A1A1A"/>
-          <w:sz w:val="20"/>
-          <w:szCs w:val="20"/>
-        </w:rPr>
         <w:t xml:space="preserve">Tech: </w:t>
       </w:r>
       <w:r>
@@ -1231,7 +1066,7 @@
           <w:sz w:val="20"/>
           <w:szCs w:val="20"/>
         </w:rPr>
-        <w:t>Unity, C#, Zenject, UniRx, UniTask, Addressables, WebGL/mobile profiling, editor tooling.</w:t>
+        <w:t>Unity, C#, URP, VContainer, R3, UniTask, Addressables, AppLovin MAX, Mirra SDK, Playgama.</w:t>
       </w:r>
     </w:p>
     <w:p>
@@ -1271,7 +1106,6 @@
           <w:rFonts w:ascii="Arial" w:hAnsi="Arial" w:cs="Arial"/>
           <w:sz w:val="20"/>
           <w:szCs w:val="20"/>
-          <w:lang w:val="en-US"/>
         </w:rPr>
       </w:pPr>
       <w:r>
@@ -1290,7 +1124,7 @@
           <w:sz w:val="20"/>
           <w:szCs w:val="20"/>
         </w:rPr>
-        <w:t xml:space="preserve"> C#, Unity, URP</w:t>
+        <w:t xml:space="preserve"> C#, Unity (URP)</w:t>
       </w:r>
     </w:p>
     <w:p>
@@ -1304,7 +1138,6 @@
           <w:rFonts w:ascii="Arial" w:hAnsi="Arial" w:cs="Arial"/>
           <w:sz w:val="20"/>
           <w:szCs w:val="20"/>
-          <w:lang w:val="en-US"/>
         </w:rPr>
       </w:pPr>
       <w:r>
@@ -1323,7 +1156,7 @@
           <w:sz w:val="20"/>
           <w:szCs w:val="20"/>
         </w:rPr>
-        <w:t xml:space="preserve"> SOLID, dependency injection, Zenject, lightweight custom context layer, hierarchical state machines, ScriptableObject-driven configuration, reactive event systems, save-system abstraction</w:t>
+        <w:t xml:space="preserve"> SOLID, dependency injection (VContainer, custom service locator), hierarchical state machines, ScriptableObject-driven configuration, reactive event systems (R3, UniRx, UniTask), save-system abstraction with multi-backend implementations</w:t>
       </w:r>
     </w:p>
     <w:p>
@@ -1355,7 +1188,7 @@
           <w:sz w:val="20"/>
           <w:szCs w:val="20"/>
         </w:rPr>
-        <w:t xml:space="preserve"> custom URP render features and passes, image-effect composition, X-ray-style visualization, WebGL shader budgeting, ShaderVariantCollection management</w:t>
+        <w:t xml:space="preserve"> custom URP render features and passes, image-effect composition, X-ray-style visualization, WebGL shader budgeting, ShaderVariantCollection management, Cinemachine 3, Unity Animation Rigging</w:t>
       </w:r>
     </w:p>
     <w:p>
@@ -1369,7 +1202,6 @@
           <w:rFonts w:ascii="Arial" w:hAnsi="Arial" w:cs="Arial"/>
           <w:sz w:val="20"/>
           <w:szCs w:val="20"/>
-          <w:lang w:val="en-US"/>
         </w:rPr>
       </w:pPr>
       <w:r>
@@ -1388,7 +1220,7 @@
           <w:sz w:val="20"/>
           <w:szCs w:val="20"/>
         </w:rPr>
-        <w:t xml:space="preserve"> ConfigurableJoints, guidewire/catheter simulation, multi-rigidbody systems, procedural meshes, blendshape-driven deformation</w:t>
+        <w:t xml:space="preserve"> custom Rigidbody vehicle controller (spring-damper, sphere-cast, drift/boost/air-control), ConfigurableJoints, guidewire/catheter simulation, multi-rigidbody systems, procedural meshes, blendshape-driven deformation</w:t>
       </w:r>
     </w:p>
     <w:p>
@@ -1402,7 +1234,6 @@
           <w:rFonts w:ascii="Arial" w:hAnsi="Arial" w:cs="Arial"/>
           <w:sz w:val="20"/>
           <w:szCs w:val="20"/>
-          <w:lang w:val="en-US"/>
         </w:rPr>
       </w:pPr>
       <w:r>
@@ -1413,15 +1244,15 @@
           <w:sz w:val="20"/>
           <w:szCs w:val="20"/>
         </w:rPr>
-        <w:t>Performance:</w:t>
-      </w:r>
-      <w:r>
-        <w:rPr>
-          <w:rFonts w:ascii="Arial" w:hAnsi="Arial" w:cs="Arial"/>
-          <w:sz w:val="20"/>
-          <w:szCs w:val="20"/>
-        </w:rPr>
-        <w:t xml:space="preserve"> Unity Profiler, Memory Profiler, GC allocation reduction, draw-call analysis and batching, WebGL build-size optimization, low-end Android profiling</w:t>
+        <w:t>Platform SDKs:</w:t>
+      </w:r>
+      <w:r>
+        <w:rPr>
+          <w:rFonts w:ascii="Arial" w:hAnsi="Arial" w:cs="Arial"/>
+          <w:sz w:val="20"/>
+          <w:szCs w:val="20"/>
+        </w:rPr>
+        <w:t xml:space="preserve"> AppLovin MAX (13 mediation adapters), Unity IAP, Google Play Billing &amp; Play Core, Mirra SDK 5, Playgama Bridge (WebGL portals)</w:t>
       </w:r>
     </w:p>
     <w:p>
@@ -1435,7 +1266,6 @@
           <w:rFonts w:ascii="Arial" w:hAnsi="Arial" w:cs="Arial"/>
           <w:sz w:val="20"/>
           <w:szCs w:val="20"/>
-          <w:lang w:val="en-US"/>
         </w:rPr>
       </w:pPr>
       <w:r>
@@ -1446,6 +1276,71 @@
           <w:sz w:val="20"/>
           <w:szCs w:val="20"/>
         </w:rPr>
+        <w:t>Analytics:</w:t>
+      </w:r>
+      <w:r>
+        <w:rPr>
+          <w:rFonts w:ascii="Arial" w:hAnsi="Arial" w:cs="Arial"/>
+          <w:sz w:val="20"/>
+          <w:szCs w:val="20"/>
+        </w:rPr>
+        <w:t xml:space="preserve"> GameAnalytics, AppMetrica, AppsFlyer, ByteBrew, Firebase Analytics</w:t>
+      </w:r>
+    </w:p>
+    <w:p>
+      <w:pPr>
+        <w:pStyle w:val="ListParagraph"/>
+        <w:numPr>
+          <w:ilvl w:val="0"/>
+          <w:numId w:val="4"/>
+        </w:numPr>
+        <w:rPr>
+          <w:rFonts w:ascii="Arial" w:hAnsi="Arial" w:cs="Arial"/>
+          <w:sz w:val="20"/>
+          <w:szCs w:val="20"/>
+          <w:lang w:val="en-US"/>
+        </w:rPr>
+      </w:pPr>
+      <w:r>
+        <w:rPr>
+          <w:rFonts w:ascii="Arial" w:hAnsi="Arial" w:cs="Arial"/>
+          <w:b/>
+          <w:bCs/>
+          <w:sz w:val="20"/>
+          <w:szCs w:val="20"/>
+        </w:rPr>
+        <w:t>Performance:</w:t>
+      </w:r>
+      <w:r>
+        <w:rPr>
+          <w:rFonts w:ascii="Arial" w:hAnsi="Arial" w:cs="Arial"/>
+          <w:sz w:val="20"/>
+          <w:szCs w:val="20"/>
+        </w:rPr>
+        <w:t xml:space="preserve"> Unity Profiler, Memory Profiler, GC allocation reduction, draw-call analysis and batching, WebGL build-size optimization, low-end Android profiling</w:t>
+      </w:r>
+    </w:p>
+    <w:p>
+      <w:pPr>
+        <w:pStyle w:val="ListParagraph"/>
+        <w:numPr>
+          <w:ilvl w:val="0"/>
+          <w:numId w:val="4"/>
+        </w:numPr>
+        <w:rPr>
+          <w:rFonts w:ascii="Arial" w:hAnsi="Arial" w:cs="Arial"/>
+          <w:sz w:val="20"/>
+          <w:szCs w:val="20"/>
+        </w:rPr>
+      </w:pPr>
+      <w:r>
+        <w:rPr>
+          <w:rFonts w:ascii="Arial" w:hAnsi="Arial" w:cs="Arial"/>
+          <w:b/>
+          <w:bCs/>
+          <w:sz w:val="20"/>
+          <w:szCs w:val="20"/>
+        </w:rPr>
         <w:t>Production Tooling:</w:t>
       </w:r>
       <w:r>
@@ -1454,7 +1349,7 @@
           <w:sz w:val="20"/>
           <w:szCs w:val="20"/>
         </w:rPr>
-        <w:t xml:space="preserve"> Addressables, editor tooling, content pipelines, build pipelines, pre-build validation, Git, code review, mentoring</w:t>
+        <w:t xml:space="preserve"> Addressables, Unity Localization, custom Editor tools, content pipelines, pre-build validation, Git</w:t>
       </w:r>
     </w:p>
     <w:p>
@@ -1635,66 +1530,7 @@
 </w:document>
 </file>
 
-<file path=word\fontTable.xml><?xml version="1.0" encoding="utf-8"?>
-<w:fonts xmlns:mc="http://schemas.openxmlformats.org/markup-compatibility/2006" xmlns:r="http://schemas.openxmlformats.org/officeDocument/2006/relationships" xmlns:w="http://schemas.openxmlformats.org/wordprocessingml/2006/main" xmlns:w14="http://schemas.microsoft.com/office/word/2010/wordml" xmlns:w15="http://schemas.microsoft.com/office/word/2012/wordml" xmlns:w16cex="http://schemas.microsoft.com/office/word/2018/wordml/cex" xmlns:w16cid="http://schemas.microsoft.com/office/word/2016/wordml/cid" xmlns:w16="http://schemas.microsoft.com/office/word/2018/wordml" xmlns:w16du="http://schemas.microsoft.com/office/word/2023/wordml/word16du" xmlns:w16sdtdh="http://schemas.microsoft.com/office/word/2020/wordml/sdtdatahash" xmlns:w16sdtfl="http://schemas.microsoft.com/office/word/2024/wordml/sdtformatlock" xmlns:w16se="http://schemas.microsoft.com/office/word/2015/wordml/symex" mc:Ignorable="w14 w15 w16se w16cid w16 w16cex w16sdtdh w16sdtfl w16du">
-  <w:font w:name="Symbol">
-    <w:panose1 w:val="05050102010706020507"/>
-    <w:charset w:val="02"/>
-    <w:family w:val="roman"/>
-    <w:pitch w:val="variable"/>
-    <w:sig w:usb0="00000000" w:usb1="10000000" w:usb2="00000000" w:usb3="00000000" w:csb0="80000000" w:csb1="00000000"/>
-  </w:font>
-  <w:font w:name="Times New Roman">
-    <w:panose1 w:val="02020603050405020304"/>
-    <w:charset w:val="00"/>
-    <w:family w:val="roman"/>
-    <w:pitch w:val="variable"/>
-    <w:sig w:usb0="E0002EFF" w:usb1="C000785B" w:usb2="00000009" w:usb3="00000000" w:csb0="000001FF" w:csb1="00000000"/>
-  </w:font>
-  <w:font w:name="Courier New">
-    <w:panose1 w:val="02070309020205020404"/>
-    <w:charset w:val="00"/>
-    <w:family w:val="modern"/>
-    <w:pitch w:val="fixed"/>
-    <w:sig w:usb0="E0002EFF" w:usb1="C0007843" w:usb2="00000009" w:usb3="00000000" w:csb0="000001FF" w:csb1="00000000"/>
-  </w:font>
-  <w:font w:name="Wingdings">
-    <w:panose1 w:val="05000000000000000000"/>
-    <w:charset w:val="02"/>
-    <w:family w:val="auto"/>
-    <w:pitch w:val="variable"/>
-    <w:sig w:usb0="00000000" w:usb1="10000000" w:usb2="00000000" w:usb3="00000000" w:csb0="80000000" w:csb1="00000000"/>
-  </w:font>
-  <w:font w:name="Calibri">
-    <w:panose1 w:val="020F0502020204030204"/>
-    <w:charset w:val="00"/>
-    <w:family w:val="swiss"/>
-    <w:pitch w:val="variable"/>
-    <w:sig w:usb0="E4002EFF" w:usb1="C200247B" w:usb2="00000009" w:usb3="00000000" w:csb0="000001FF" w:csb1="00000000"/>
-  </w:font>
-  <w:font w:name="Arial">
-    <w:panose1 w:val="020B0604020202020204"/>
-    <w:charset w:val="00"/>
-    <w:family w:val="swiss"/>
-    <w:pitch w:val="variable"/>
-    <w:sig w:usb0="E0002EFF" w:usb1="C000785B" w:usb2="00000009" w:usb3="00000000" w:csb0="000001FF" w:csb1="00000000"/>
-  </w:font>
-  <w:font w:name="Aptos Display">
-    <w:charset w:val="00"/>
-    <w:family w:val="swiss"/>
-    <w:pitch w:val="variable"/>
-    <w:sig w:usb0="20000287" w:usb1="00000003" w:usb2="00000000" w:usb3="00000000" w:csb0="0000019F" w:csb1="00000000"/>
-  </w:font>
-  <w:font w:name="Aptos">
-    <w:charset w:val="00"/>
-    <w:family w:val="swiss"/>
-    <w:pitch w:val="variable"/>
-    <w:sig w:usb0="20000287" w:usb1="00000003" w:usb2="00000000" w:usb3="00000000" w:csb0="0000019F" w:csb1="00000000"/>
-  </w:font>
-</w:fonts>
-</file>
-
-<file path=word\numbering.xml><?xml version="1.0" encoding="utf-8"?>
+<file path=word/numbering.xml><?xml version="1.0" encoding="utf-8"?>
 <w:numbering xmlns:wpc="http://schemas.microsoft.com/office/word/2010/wordprocessingCanvas" xmlns:cx="http://schemas.microsoft.com/office/drawing/2014/chartex" xmlns:cx1="http://schemas.microsoft.com/office/drawing/2015/9/8/chartex" xmlns:cx2="http://schemas.microsoft.com/office/drawing/2015/10/21/chartex" xmlns:cx3="http://schemas.microsoft.com/office/drawing/2016/5/9/chartex" xmlns:cx4="http://schemas.microsoft.com/office/drawing/2016/5/10/chartex" xmlns:cx5="http://schemas.microsoft.com/office/drawing/2016/5/11/chartex" xmlns:cx6="http://schemas.microsoft.com/office/drawing/2016/5/12/chartex" xmlns:cx7="http://schemas.microsoft.com/office/drawing/2016/5/13/chartex" xmlns:cx8="http://schemas.microsoft.com/office/drawing/2016/5/14/chartex" xmlns:mc="http://schemas.openxmlformats.org/markup-compatibility/2006" xmlns:aink="http://schemas.microsoft.com/office/drawing/2016/ink" xmlns:am3d="http://schemas.microsoft.com/office/drawing/2017/model3d" xmlns:o="urn:schemas-microsoft-com:office:office" xmlns:oel="http://schemas.microsoft.com/office/2019/extlst" xmlns:r="http://schemas.openxmlformats.org/officeDocument/2006/relationships" xmlns:m="http://schemas.openxmlformats.org/officeDocument/2006/math" xmlns:v="urn:schemas-microsoft-com:vml" xmlns:wp14="http://schemas.microsoft.com/office/word/2010/wordprocessingDrawing" xmlns:wp="http://schemas.openxmlformats.org/drawingml/2006/wordprocessingDrawing" xmlns:w10="urn:schemas-microsoft-com:office:word" xmlns:w="http://schemas.openxmlformats.org/wordprocessingml/2006/main" xmlns:w14="http://schemas.microsoft.com/office/word/2010/wordml" xmlns:w15="http://schemas.microsoft.com/office/word/2012/wordml" xmlns:w16cex="http://schemas.microsoft.com/office/word/2018/wordml/cex" xmlns:w16cid="http://schemas.microsoft.com/office/word/2016/wordml/cid" xmlns:w16="http://schemas.microsoft.com/office/word/2018/wordml" xmlns:w16du="http://schemas.microsoft.com/office/word/2023/wordml/word16du" xmlns:w16sdtdh="http://schemas.microsoft.com/office/word/2020/wordml/sdtdatahash" xmlns:w16sdtfl="http://schemas.microsoft.com/office/word/2024/wordml/sdtformatlock" xmlns:w16se="http://schemas.microsoft.com/office/word/2015/wordml/symex" xmlns:wpg="http://schemas.microsoft.com/office/word/2010/wordprocessingGroup" xmlns:wpi="http://schemas.microsoft.com/office/word/2010/wordprocessingInk" xmlns:wne="http://schemas.microsoft.com/office/word/2006/wordml" xmlns:wps="http://schemas.microsoft.com/office/word/2010/wordprocessingShape" mc:Ignorable="w14 w15 w16se w16cid w16 w16cex w16sdtdh w16sdtfl w16du wp14">
   <w:abstractNum w:abstractNumId="0" w15:restartNumberingAfterBreak="0">
     <w:nsid w:val="00670FE0"/>
@@ -2083,68 +1919,7 @@
 </w:numbering>
 </file>
 
-<file path=word\settings.xml><?xml version="1.0" encoding="utf-8"?>
-<w:settings xmlns:mc="http://schemas.openxmlformats.org/markup-compatibility/2006" xmlns:o="urn:schemas-microsoft-com:office:office" xmlns:r="http://schemas.openxmlformats.org/officeDocument/2006/relationships" xmlns:m="http://schemas.openxmlformats.org/officeDocument/2006/math" xmlns:v="urn:schemas-microsoft-com:vml" xmlns:w10="urn:schemas-microsoft-com:office:word" xmlns:w="http://schemas.openxmlformats.org/wordprocessingml/2006/main" xmlns:w14="http://schemas.microsoft.com/office/word/2010/wordml" xmlns:w15="http://schemas.microsoft.com/office/word/2012/wordml" xmlns:w16cex="http://schemas.microsoft.com/office/word/2018/wordml/cex" xmlns:w16cid="http://schemas.microsoft.com/office/word/2016/wordml/cid" xmlns:w16="http://schemas.microsoft.com/office/word/2018/wordml" xmlns:w16du="http://schemas.microsoft.com/office/word/2023/wordml/word16du" xmlns:w16sdtdh="http://schemas.microsoft.com/office/word/2020/wordml/sdtdatahash" xmlns:w16sdtfl="http://schemas.microsoft.com/office/word/2024/wordml/sdtformatlock" xmlns:w16se="http://schemas.microsoft.com/office/word/2015/wordml/symex" xmlns:sl="http://schemas.openxmlformats.org/schemaLibrary/2006/main" mc:Ignorable="w14 w15 w16se w16cid w16 w16cex w16sdtdh w16sdtfl w16du">
-  <w:zoom w:percent="100"/>
-  <w:displayBackgroundShape/>
-  <w:proofState w:spelling="clean" w:grammar="clean"/>
-  <w:defaultTabStop w:val="720"/>
-  <w:characterSpacingControl w:val="doNotCompress"/>
-  <w:compat>
-    <w:compatSetting w:name="compatibilityMode" w:uri="http://schemas.microsoft.com/office/word" w:val="15"/>
-    <w:compatSetting w:name="overrideTableStyleFontSizeAndJustification" w:uri="http://schemas.microsoft.com/office/word" w:val="1"/>
-    <w:compatSetting w:name="enableOpenTypeFeatures" w:uri="http://schemas.microsoft.com/office/word" w:val="1"/>
-    <w:compatSetting w:name="doNotFlipMirrorIndents" w:uri="http://schemas.microsoft.com/office/word" w:val="1"/>
-    <w:compatSetting w:name="differentiateMultirowTableHeaders" w:uri="http://schemas.microsoft.com/office/word" w:val="1"/>
-    <w:compatSetting w:name="useWord2013TrackBottomHyphenation" w:uri="http://schemas.microsoft.com/office/word" w:val="1"/>
-  </w:compat>
-  <w:rsids>
-    <w:rsidRoot w:val="005A067A"/>
-    <w:rsid w:val="000A4134"/>
-    <w:rsid w:val="000D3E23"/>
-    <w:rsid w:val="000D6D00"/>
-    <w:rsid w:val="000F0AFD"/>
-    <w:rsid w:val="001F64FE"/>
-    <w:rsid w:val="0020486C"/>
-    <w:rsid w:val="0027778C"/>
-    <w:rsid w:val="002B75F6"/>
-    <w:rsid w:val="002E2FFE"/>
-    <w:rsid w:val="00317A16"/>
-    <w:rsid w:val="005A067A"/>
-    <w:rsid w:val="008E4358"/>
-    <w:rsid w:val="00927B9C"/>
-    <w:rsid w:val="00AE603D"/>
-    <w:rsid w:val="00FC1587"/>
-  </w:rsids>
-  <m:mathPr>
-    <m:mathFont m:val="Cambria Math"/>
-    <m:brkBin m:val="before"/>
-    <m:brkBinSub m:val="--"/>
-    <m:smallFrac m:val="0"/>
-    <m:dispDef/>
-    <m:lMargin m:val="0"/>
-    <m:rMargin m:val="0"/>
-    <m:defJc m:val="centerGroup"/>
-    <m:wrapIndent m:val="1440"/>
-    <m:intLim m:val="subSup"/>
-    <m:naryLim m:val="undOvr"/>
-  </m:mathPr>
-  <w:themeFontLang/>
-  <w:clrSchemeMapping w:bg1="light1" w:t1="dark1" w:bg2="light2" w:t2="dark2" w:accent1="accent1" w:accent2="accent2" w:accent3="accent3" w:accent4="accent4" w:accent5="accent5" w:accent6="accent6" w:hyperlink="hyperlink" w:followedHyperlink="followedHyperlink"/>
-  <w:shapeDefaults>
-    <o:shapedefaults v:ext="edit" spidmax="1026"/>
-    <o:shapelayout v:ext="edit">
-      <o:idmap v:ext="edit" data="1"/>
-    </o:shapelayout>
-  </w:shapeDefaults>
-  <w:decimalSymbol w:val="."/>
-  <w:listSeparator w:val=","/>
-  <w14:docId w14:val="465B68F2"/>
-  <w15:docId w15:val="{1876F3D3-20E2-4074-B474-21A9E593638D}"/>
-</w:settings>
-</file>
-
-<file path=word\styles.xml><?xml version="1.0" encoding="utf-8"?>
+<file path=word/styles.xml><?xml version="1.0" encoding="utf-8"?>
 <w:styles xmlns:mc="http://schemas.openxmlformats.org/markup-compatibility/2006" xmlns:r="http://schemas.openxmlformats.org/officeDocument/2006/relationships" xmlns:w="http://schemas.openxmlformats.org/wordprocessingml/2006/main" xmlns:w14="http://schemas.microsoft.com/office/word/2010/wordml" xmlns:w15="http://schemas.microsoft.com/office/word/2012/wordml" xmlns:w16cex="http://schemas.microsoft.com/office/word/2018/wordml/cex" xmlns:w16cid="http://schemas.microsoft.com/office/word/2016/wordml/cid" xmlns:w16="http://schemas.microsoft.com/office/word/2018/wordml" xmlns:w16du="http://schemas.microsoft.com/office/word/2023/wordml/word16du" xmlns:w16sdtdh="http://schemas.microsoft.com/office/word/2020/wordml/sdtdatahash" xmlns:w16sdtfl="http://schemas.microsoft.com/office/word/2024/wordml/sdtformatlock" xmlns:w16se="http://schemas.microsoft.com/office/word/2015/wordml/symex" mc:Ignorable="w14 w15 w16se w16cid w16 w16cex w16sdtdh w16sdtfl w16du">
   <w:docDefaults>
     <w:rPrDefault>
@@ -2769,7 +2544,7 @@
 </w:styles>
 </file>
 
-<file path=word\theme\theme1.xml><?xml version="1.0" encoding="utf-8"?>
+<file path=word/theme/theme1.xml><?xml version="1.0" encoding="utf-8"?>
 <a:theme xmlns:a="http://schemas.openxmlformats.org/drawingml/2006/main" name="Office Theme">
   <a:themeElements>
     <a:clrScheme name="Office">
@@ -3082,8 +2857,4 @@
     </a:ext>
   </a:extLst>
 </a:theme>
-</file>
-
-<file path=word\webSettings.xml><?xml version="1.0" encoding="utf-8"?>
-<w:webSettings xmlns:mc="http://schemas.openxmlformats.org/markup-compatibility/2006" xmlns:r="http://schemas.openxmlformats.org/officeDocument/2006/relationships" xmlns:w="http://schemas.openxmlformats.org/wordprocessingml/2006/main" xmlns:w14="http://schemas.microsoft.com/office/word/2010/wordml" xmlns:w15="http://schemas.microsoft.com/office/word/2012/wordml" xmlns:w16cex="http://schemas.microsoft.com/office/word/2018/wordml/cex" xmlns:w16cid="http://schemas.microsoft.com/office/word/2016/wordml/cid" xmlns:w16="http://schemas.microsoft.com/office/word/2018/wordml" xmlns:w16du="http://schemas.microsoft.com/office/word/2023/wordml/word16du" xmlns:w16sdtdh="http://schemas.microsoft.com/office/word/2020/wordml/sdtdatahash" xmlns:w16sdtfl="http://schemas.microsoft.com/office/word/2024/wordml/sdtformatlock" xmlns:w16se="http://schemas.microsoft.com/office/word/2015/wordml/symex" mc:Ignorable="w14 w15 w16se w16cid w16 w16cex w16sdtdh w16sdtfl w16du"/>
 </file>
</xml_diff>

<commit_message>
Remove dash separators from portfolio and CV
</commit_message>
<xml_diff>
--- a/Iusup_Abduliaparov_CV_Simulation_v2_ATS.docx
+++ b/Iusup_Abduliaparov_CV_Simulation_v2_ATS.docx
@@ -432,7 +432,7 @@
           <w:sz w:val="20"/>
           <w:szCs w:val="20"/>
         </w:rPr>
-        <w:t>2025 – Present</w:t>
+        <w:t>2025 to Present</w:t>
       </w:r>
     </w:p>
     <w:p>
@@ -860,7 +860,7 @@
           <w:sz w:val="20"/>
           <w:szCs w:val="20"/>
         </w:rPr>
-        <w:t xml:space="preserve">2023 – </w:t>
+        <w:t xml:space="preserve">2023 to </w:t>
       </w:r>
       <w:r>
         <w:rPr>
@@ -964,7 +964,7 @@
           <w:sz w:val="20"/>
           <w:szCs w:val="20"/>
         </w:rPr>
-        <w:t>Built a 1k-line custom Rigidbody vehicle controller — spring-damper suspension with bump stops and sphere-cast wheel probes, drift, boost, downforce, air control and auto-recovery — refactored from an earlier ConfigurableJoint prototype to stabilize handling for the game's arcade feel.</w:t>
+        <w:t>Built a 1k-line custom Rigidbody vehicle controller: spring-damper suspension with bump stops and sphere-cast wheel probes, drift, boost, downforce, air control and auto-recovery; refactored from an earlier ConfigurableJoint prototype to stabilize handling for the game's arcade feel.</w:t>
       </w:r>
     </w:p>
     <w:p>
@@ -1012,7 +1012,7 @@
           <w:sz w:val="20"/>
           <w:szCs w:val="20"/>
         </w:rPr>
-        <w:t>Integrated production monetization stack — AppLovin MAX with 13 mediation adapters, Unity IAP, Google Play Billing and Play Core in-app updates — and five analytics SDKs (GameAnalytics, AppMetrica, AppsFlyer, ByteBrew, Firebase) behind a single facade.</w:t>
+        <w:t>Integrated production monetization stack: AppLovin MAX with 13 mediation adapters, Unity IAP, Google Play Billing and Play Core in-app updates, plus five analytics SDKs (GameAnalytics, AppMetrica, AppsFlyer, ByteBrew, Firebase) behind a single facade.</w:t>
       </w:r>
     </w:p>
     <w:p>
@@ -1448,7 +1448,7 @@
           <w:sz w:val="20"/>
           <w:szCs w:val="20"/>
         </w:rPr>
-        <w:t>2024 – Present</w:t>
+        <w:t>2024 to Present</w:t>
       </w:r>
     </w:p>
     <w:p>
@@ -1517,7 +1517,7 @@
           <w:sz w:val="20"/>
           <w:szCs w:val="20"/>
         </w:rPr>
-        <w:t>2022 – 2024</w:t>
+        <w:t>2022 to 2024</w:t>
       </w:r>
     </w:p>
     <w:sectPr>

</xml_diff>

<commit_message>
Rewrite the simulation profile around what the trainer actually does
The Angio entry still described the brief rather than the built system, and led
with method where a reader needs outcome. Rewritten outcome-first, one metric
per bullet where an honest one exists: the five-pass fluoroscopy renderer, dye
transported on a 19-segment vessel graph so filling follows anatomy and stops at
an occlusion, the 12.3 ms to 4.7 ms injection hitch, instrument physics on a rod
solver, and balloon recoil versus permanent stent fixation.

Skills split Simulation out from Physics and surface the imaging vocabulary
(fluoroscopy, DSA, DRR) a medtech reader screens for. CV docx and pdf rebuilt to
match the page.

Fixes iOS rendering of the theme toggle and link arrows: U+2600 and U+2197
default to emoji presentation, so Safari drew them as colour emoji. The toggle
is now inline SVG and the arrows carry U+FE0E.
</commit_message>
<xml_diff>
--- a/Iusup_Abduliaparov_CV_Simulation_v2_ATS.docx
+++ b/Iusup_Abduliaparov_CV_Simulation_v2_ATS.docx
@@ -40,16 +40,7 @@
           <w:sz w:val="22"/>
           <w:szCs w:val="22"/>
         </w:rPr>
-        <w:t xml:space="preserve">Unity C# Engineer | </w:t>
-      </w:r>
-      <w:r>
-        <w:rPr>
-          <w:rFonts w:ascii="Arial" w:hAnsi="Arial" w:cs="Arial"/>
-          <w:color w:val="1F4E79"/>
-          <w:sz w:val="22"/>
-          <w:szCs w:val="22"/>
-        </w:rPr>
-        <w:t>Simulation, WebGL and Real-Time 3D Applications</w:t>
+        <w:t xml:space="preserve">Unity C# Engineer | Medical Simulation, Real-Time Rendering and Physics</w:t>
       </w:r>
     </w:p>
     <w:p>
@@ -265,35 +256,7 @@
           <w:szCs w:val="20"/>
           <w:lang w:val="en-US"/>
         </w:rPr>
-        <w:t>I</w:t>
-      </w:r>
-      <w:r>
-        <w:rPr>
-          <w:rFonts w:ascii="Arial" w:hAnsi="Arial" w:cs="Arial"/>
-          <w:color w:val="1A1A1A"/>
-          <w:sz w:val="20"/>
-          <w:szCs w:val="20"/>
-        </w:rPr>
-        <w:t xml:space="preserve"> build interactive training and visualization systems with strong attention to architecture, performance and production constraints. Recent work includes a medical angiography simulator with real-time X-ray-style rendering, catheter interaction, procedural workflow logic and a hardware-oriented C-arm control layer. Previously shipped and optimized a high-traffic Unity WebGL</w:t>
-      </w:r>
-      <w:r>
-        <w:rPr>
-          <w:rFonts w:ascii="Arial" w:hAnsi="Arial" w:cs="Arial"/>
-          <w:color w:val="1A1A1A"/>
-          <w:sz w:val="20"/>
-          <w:szCs w:val="20"/>
-          <w:lang w:val="en-US"/>
-        </w:rPr>
-        <w:t xml:space="preserve"> </w:t>
-      </w:r>
-      <w:r>
-        <w:rPr>
-          <w:rFonts w:ascii="Arial" w:hAnsi="Arial" w:cs="Arial"/>
-          <w:color w:val="1A1A1A"/>
-          <w:sz w:val="20"/>
-          <w:szCs w:val="20"/>
-        </w:rPr>
-        <w:t>product reaching 9M+ users at 40k DAU peak, plus nine standalone WebGL titles built on a shared codebase.</w:t>
+        <w:t xml:space="preserve">Unity C# engineer specialising in real-time simulation and visualization. Currently the sole engineer on a coronary angiography trainer, building its fluoroscopic imaging, contrast haemodynamics, instrument physics and the angioplasty and stenting workflow, validated against reference angiograms with clinical reviewers. Earlier work shipped high-traffic real-time products reaching 9M+ users at 40k DAU peak, cutting WebGL build size from 100 MB to 20 MB and lifting low-end Android from ~15 to a stable 60 FPS.</w:t>
       </w:r>
     </w:p>
     <w:p>
@@ -344,59 +307,7 @@
           <w:sz w:val="22"/>
           <w:szCs w:val="22"/>
         </w:rPr>
-        <w:t>Medical Training Simulator (NDA)</w:t>
-      </w:r>
-      <w:r>
-        <w:tab/>
-      </w:r>
-      <w:r>
-        <w:rPr>
-          <w:rFonts w:ascii="Arial" w:hAnsi="Arial" w:cs="Arial"/>
-          <w:color w:val="555555"/>
-          <w:sz w:val="20"/>
-          <w:szCs w:val="20"/>
-        </w:rPr>
-        <w:t>Remote</w:t>
-      </w:r>
-      <w:r>
-        <w:rPr>
-          <w:rFonts w:ascii="Arial" w:hAnsi="Arial" w:cs="Arial"/>
-          <w:color w:val="555555"/>
-          <w:sz w:val="20"/>
-          <w:szCs w:val="20"/>
-          <w:lang w:val="en-US"/>
-        </w:rPr>
-        <w:t xml:space="preserve"> </w:t>
-      </w:r>
-      <w:r>
-        <w:rPr>
-          <w:rFonts w:ascii="Arial" w:hAnsi="Arial" w:cs="Arial"/>
-          <w:color w:val="555555"/>
-          <w:sz w:val="20"/>
-          <w:szCs w:val="20"/>
-          <w:lang w:val="en-US"/>
-        </w:rPr>
-        <w:t>(</w:t>
-      </w:r>
-      <w:r>
-        <w:rPr>
-          <w:rFonts w:ascii="Arial" w:hAnsi="Arial" w:cs="Arial"/>
-          <w:color w:val="555555"/>
-          <w:sz w:val="20"/>
-          <w:szCs w:val="20"/>
-          <w:lang w:val="en-US"/>
-        </w:rPr>
-        <w:t>contract</w:t>
-      </w:r>
-      <w:r>
-        <w:rPr>
-          <w:rFonts w:ascii="Arial" w:hAnsi="Arial" w:cs="Arial"/>
-          <w:color w:val="555555"/>
-          <w:sz w:val="20"/>
-          <w:szCs w:val="20"/>
-          <w:lang w:val="en-US"/>
-        </w:rPr>
-        <w:t>)</w:t>
+        <w:t xml:space="preserve">Coronary Angiography Simulator</w:t>
       </w:r>
     </w:p>
     <w:p>
@@ -454,65 +365,7 @@
           <w:sz w:val="20"/>
           <w:szCs w:val="20"/>
         </w:rPr>
-        <w:t>Building core Unity systems for an angiography training simulator covering X-ray-style visualization, guidewire</w:t>
-      </w:r>
-      <w:r>
-        <w:rPr>
-          <w:rFonts w:ascii="Arial" w:hAnsi="Arial" w:cs="Arial"/>
-          <w:i/>
-          <w:iCs/>
-          <w:color w:val="4B4B4B"/>
-          <w:sz w:val="20"/>
-          <w:szCs w:val="20"/>
-          <w:lang w:val="en-US"/>
-        </w:rPr>
-        <w:t xml:space="preserve"> </w:t>
-      </w:r>
-      <w:r>
-        <w:rPr>
-          <w:rFonts w:ascii="Arial" w:hAnsi="Arial" w:cs="Arial"/>
-          <w:i/>
-          <w:iCs/>
-          <w:color w:val="4B4B4B"/>
-          <w:sz w:val="20"/>
-          <w:szCs w:val="20"/>
-          <w:lang w:val="en-US"/>
-        </w:rPr>
-        <w:t xml:space="preserve">and </w:t>
-      </w:r>
-      <w:r>
-        <w:rPr>
-          <w:rFonts w:ascii="Arial" w:hAnsi="Arial" w:cs="Arial"/>
-          <w:i/>
-          <w:iCs/>
-          <w:color w:val="4B4B4B"/>
-          <w:sz w:val="20"/>
-          <w:szCs w:val="20"/>
-        </w:rPr>
-        <w:t>catheter interaction, contrast injection, C-arm operation and balloon</w:t>
-      </w:r>
-      <w:r>
-        <w:rPr>
-          <w:rFonts w:ascii="Arial" w:hAnsi="Arial" w:cs="Arial"/>
-          <w:i/>
-          <w:iCs/>
-          <w:color w:val="4B4B4B"/>
-          <w:sz w:val="20"/>
-          <w:szCs w:val="20"/>
-          <w:lang w:val="en-US"/>
-        </w:rPr>
-        <w:t xml:space="preserve"> </w:t>
-      </w:r>
-      <w:r>
-        <w:rPr>
-          <w:rFonts w:ascii="Arial" w:hAnsi="Arial" w:cs="Arial"/>
-          <w:i/>
-          <w:iCs/>
-          <w:color w:val="4B4B4B"/>
-          <w:sz w:val="20"/>
-          <w:szCs w:val="20"/>
-        </w:rPr>
-        <w:t>stent procedure logic.</w:t>
+        <w:t xml:space="preserve">Sole engineer on a coronary angiography trainer used to rehearse catheter procedures: X-ray imaging, contrast behaviour, instrument physics and the balloon and stent workflow, matched to reference angiograms with clinical reviewers.</w:t>
       </w:r>
     </w:p>
     <w:p>
@@ -536,7 +389,7 @@
           <w:sz w:val="20"/>
           <w:szCs w:val="20"/>
         </w:rPr>
-        <w:t>Worked with clinical reviewers to convert procedure requirements into simulator states, validation rules and instrument profiles.</w:t>
+        <w:t xml:space="preserve">Delivered the X-ray imaging pipeline as a five-pass URP render feature (per-tissue density accumulation, detector gain and lag, DSA subtraction road-mapping and a CT volume path), tuned frame by frame against reference angiograms.</w:t>
       </w:r>
     </w:p>
     <w:p>
@@ -560,27 +413,7 @@
           <w:sz w:val="20"/>
           <w:szCs w:val="20"/>
         </w:rPr>
-        <w:t xml:space="preserve">Built a </w:t>
-      </w:r>
-      <w:r>
-        <w:rPr>
-          <w:rFonts w:ascii="Arial" w:hAnsi="Arial" w:cs="Arial"/>
-          <w:b/>
-          <w:bCs/>
-          <w:color w:val="1A1A1A"/>
-          <w:sz w:val="20"/>
-          <w:szCs w:val="20"/>
-        </w:rPr>
-        <w:t>real-time URP X-ray-style rendering pipeline</w:t>
-      </w:r>
-      <w:r>
-        <w:rPr>
-          <w:rFonts w:ascii="Arial" w:hAnsi="Arial" w:cs="Arial"/>
-          <w:color w:val="1A1A1A"/>
-          <w:sz w:val="20"/>
-          <w:szCs w:val="20"/>
-        </w:rPr>
-        <w:t xml:space="preserve"> using density accumulation, multi-pass composition and instrument overlays.</w:t>
+        <w:t xml:space="preserve">Made contrast behave like injected dye rather than an animation: advection-diffusion transport solved on a 19-segment vessel graph built from the artery mesh, so filling follows anatomy, slows through a stenosis and stops at an occlusion.</w:t>
       </w:r>
     </w:p>
     <w:p>
@@ -604,27 +437,7 @@
           <w:sz w:val="20"/>
           <w:szCs w:val="20"/>
         </w:rPr>
-        <w:t xml:space="preserve">Implemented </w:t>
-      </w:r>
-      <w:r>
-        <w:rPr>
-          <w:rFonts w:ascii="Arial" w:hAnsi="Arial" w:cs="Arial"/>
-          <w:b/>
-          <w:bCs/>
-          <w:color w:val="1A1A1A"/>
-          <w:sz w:val="20"/>
-          <w:szCs w:val="20"/>
-        </w:rPr>
-        <w:t>guidewire and catheter interaction</w:t>
-      </w:r>
-      <w:r>
-        <w:rPr>
-          <w:rFonts w:ascii="Arial" w:hAnsi="Arial" w:cs="Arial"/>
-          <w:color w:val="1A1A1A"/>
-          <w:sz w:val="20"/>
-          <w:szCs w:val="20"/>
-        </w:rPr>
-        <w:t>, proximal-end actuation and bifurcation handling, supporting 8 instrument profiles without per-instrument code branches.</w:t>
+        <w:t xml:space="preserve">Cut the injection frame hitch 2.6x, from 12.3 ms to 4.7 ms, through profiler-driven work on the graph solver, holding real-time rates while the physics solver already consumed 59% of the frame.</w:t>
       </w:r>
     </w:p>
     <w:p>
@@ -648,27 +461,7 @@
           <w:sz w:val="20"/>
           <w:szCs w:val="20"/>
         </w:rPr>
-        <w:t xml:space="preserve">Developed a </w:t>
-      </w:r>
-      <w:r>
-        <w:rPr>
-          <w:rFonts w:ascii="Arial" w:hAnsi="Arial" w:cs="Arial"/>
-          <w:b/>
-          <w:bCs/>
-          <w:color w:val="1A1A1A"/>
-          <w:sz w:val="20"/>
-          <w:szCs w:val="20"/>
-        </w:rPr>
-        <w:t>procedural balloon/stent workflow</w:t>
-      </w:r>
-      <w:r>
-        <w:rPr>
-          <w:rFonts w:ascii="Arial" w:hAnsi="Arial" w:cs="Arial"/>
-          <w:color w:val="1A1A1A"/>
-          <w:sz w:val="20"/>
-          <w:szCs w:val="20"/>
-        </w:rPr>
-        <w:t xml:space="preserve"> with radius control, vessel deformation, state validation and deployment gating based on positioning and inflation state.</w:t>
+        <w:t xml:space="preserve">Kept injection honest under motion: independent boluses superpose in a single field and the still-emitting volume tracks the catheter tip through a breathing, beating vessel.</w:t>
       </w:r>
     </w:p>
     <w:p>
@@ -692,27 +485,7 @@
           <w:sz w:val="20"/>
           <w:szCs w:val="20"/>
         </w:rPr>
-        <w:t xml:space="preserve">Designed a </w:t>
-      </w:r>
-      <w:r>
-        <w:rPr>
-          <w:rFonts w:ascii="Arial" w:hAnsi="Arial" w:cs="Arial"/>
-          <w:b/>
-          <w:bCs/>
-          <w:color w:val="1A1A1A"/>
-          <w:sz w:val="20"/>
-          <w:szCs w:val="20"/>
-        </w:rPr>
-        <w:t>hardware-abstraction layer for C-arm controls</w:t>
-      </w:r>
-      <w:r>
-        <w:rPr>
-          <w:rFonts w:ascii="Arial" w:hAnsi="Arial" w:cs="Arial"/>
-          <w:color w:val="1A1A1A"/>
-          <w:sz w:val="20"/>
-          <w:szCs w:val="20"/>
-        </w:rPr>
-        <w:t>, separating simulator logic from input devices and preparing the system for future physical rig integration.</w:t>
+        <w:t xml:space="preserve">Built instrument physics on a tail-driven rod solver with lumen coupling so catheter and guidewire move coaxially, with 8 instrument profiles defined by configuration rather than code.</w:t>
       </w:r>
     </w:p>
     <w:p>
@@ -736,27 +509,7 @@
           <w:sz w:val="20"/>
           <w:szCs w:val="20"/>
         </w:rPr>
-        <w:t xml:space="preserve">Built a </w:t>
-      </w:r>
-      <w:r>
-        <w:rPr>
-          <w:rFonts w:ascii="Arial" w:hAnsi="Arial" w:cs="Arial"/>
-          <w:b/>
-          <w:bCs/>
-          <w:color w:val="1A1A1A"/>
-          <w:sz w:val="20"/>
-          <w:szCs w:val="20"/>
-        </w:rPr>
-        <w:t>ScriptableObject-driven instrument framework</w:t>
-      </w:r>
-      <w:r>
-        <w:rPr>
-          <w:rFonts w:ascii="Arial" w:hAnsi="Arial" w:cs="Arial"/>
-          <w:color w:val="1A1A1A"/>
-          <w:sz w:val="20"/>
-          <w:szCs w:val="20"/>
-        </w:rPr>
-        <w:t xml:space="preserve"> for collision settings, X-ray layer mapping and reusable rig slots, allowing new instrument profiles to be added through configuration rather than code.</w:t>
+        <w:t xml:space="preserve">Modelled treatment as it is performed: the balloon opens the lesion and elastically recoils, while a stent crimped on it expands, implants on deflation and stays fixed to the breathing vessel wall.</w:t>
       </w:r>
     </w:p>
     <w:p>

</xml_diff>

<commit_message>
position portfolio for simulation engineering
</commit_message>
<xml_diff>
--- a/Iusup_Abduliaparov_CV_Simulation_v2_ATS.docx
+++ b/Iusup_Abduliaparov_CV_Simulation_v2_ATS.docx
@@ -40,7 +40,7 @@
           <w:sz w:val="22"/>
           <w:szCs w:val="22"/>
         </w:rPr>
-        <w:t xml:space="preserve">Unity C# Engineer | Medical Simulation, Real-Time Rendering and Physics</w:t>
+        <w:t>C# Simulation Software Engineer | Real-Time 3D, Rendering &amp; Physics</w:t>
       </w:r>
     </w:p>
     <w:p>
@@ -256,7 +256,7 @@
           <w:szCs w:val="20"/>
           <w:lang w:val="en-US"/>
         </w:rPr>
-        <w:t xml:space="preserve">Unity C# engineer specialising in real-time simulation and visualization. Currently the sole engineer on a coronary angiography trainer, building its fluoroscopic imaging, contrast haemodynamics, instrument physics and the angioplasty and stenting workflow, validated against reference angiograms with clinical reviewers. Earlier work shipped high-traffic real-time products reaching 9M+ users at 40k DAU peak, cutting WebGL build size from 100 MB to 20 MB and lifting low-end Android from ~15 to a stable 60 FPS.</w:t>
+        <w:t>C# simulation software engineer specialising in real-time medical imaging, numerical transport, instrument physics and performance-critical 3D systems. Sole engineer on a coronary angiography trainer validated against reference angiograms with clinical reviewers. Earlier work reached 9M+ users at 40k DAU peak, reducing a WebGL build from 100 MB to 20 MB and improving low-end Android performance from ~15 to a stable 60 FPS.</w:t>
       </w:r>
     </w:p>
     <w:p>
@@ -331,7 +331,7 @@
           <w:sz w:val="22"/>
           <w:szCs w:val="22"/>
         </w:rPr>
-        <w:t>Unity Simulation Engineer</w:t>
+        <w:t>Simulation Software Engineer</w:t>
       </w:r>
       <w:r>
         <w:tab/>
@@ -365,7 +365,7 @@
           <w:sz w:val="20"/>
           <w:szCs w:val="20"/>
         </w:rPr>
-        <w:t xml:space="preserve">Sole engineer on a coronary angiography trainer used to rehearse catheter procedures: X-ray imaging, contrast behaviour, instrument physics and the balloon and stent workflow, matched to reference angiograms with clinical reviewers.</w:t>
+        <w:t>Sole engineer on a coronary angiography trainer spanning X-ray imaging, contrast transport, instrument physics and balloon/stent treatment, validated against reference angiograms with clinical reviewers.</w:t>
       </w:r>
     </w:p>
     <w:p>
@@ -389,7 +389,7 @@
           <w:sz w:val="20"/>
           <w:szCs w:val="20"/>
         </w:rPr>
-        <w:t xml:space="preserve">Delivered the X-ray imaging pipeline as a five-pass URP render feature (per-tissue density accumulation, detector gain and lag, DSA subtraction road-mapping and a CT volume path), tuned frame by frame against reference angiograms.</w:t>
+        <w:t>Built a five-pass URP fluoroscopy pipeline with tissue-density accumulation, detector gain/lag, DSA road-mapping and a CT-volume path; tuned frame by frame against reference angiograms.</w:t>
       </w:r>
     </w:p>
     <w:p>
@@ -413,7 +413,7 @@
           <w:sz w:val="20"/>
           <w:szCs w:val="20"/>
         </w:rPr>
-        <w:t xml:space="preserve">Made contrast behave like injected dye rather than an animation: advection-diffusion transport solved on a 19-segment vessel graph built from the artery mesh, so filling follows anatomy, slows through a stenosis and stops at an occlusion.</w:t>
+        <w:t>Implemented advection-diffusion contrast transport on a 19-segment vessel graph derived from the artery mesh, reproducing anatomical filling, stenosis slowdown and occlusion.</w:t>
       </w:r>
     </w:p>
     <w:p>
@@ -437,7 +437,7 @@
           <w:sz w:val="20"/>
           <w:szCs w:val="20"/>
         </w:rPr>
-        <w:t xml:space="preserve">Cut the injection frame hitch 2.6x, from 12.3 ms to 4.7 ms, through profiler-driven work on the graph solver, holding real-time rates while the physics solver already consumed 59% of the frame.</w:t>
+        <w:t>Reduced the injection frame hitch 2.6x, from 12.3 ms to 4.7 ms, while physics already consumed 59% of the frame.</w:t>
       </w:r>
     </w:p>
     <w:p>
@@ -461,7 +461,7 @@
           <w:sz w:val="20"/>
           <w:szCs w:val="20"/>
         </w:rPr>
-        <w:t xml:space="preserve">Kept injection honest under motion: independent boluses superpose in a single field and the still-emitting volume tracks the catheter tip through a breathing, beating vessel.</w:t>
+        <w:t>Made multiple boluses superpose in one field while the emitting volume tracks the catheter tip through a breathing, beating vessel.</w:t>
       </w:r>
     </w:p>
     <w:p>
@@ -485,7 +485,7 @@
           <w:sz w:val="20"/>
           <w:szCs w:val="20"/>
         </w:rPr>
-        <w:t xml:space="preserve">Built instrument physics on a tail-driven rod solver with lumen coupling so catheter and guidewire move coaxially, with 8 instrument profiles defined by configuration rather than code.</w:t>
+        <w:t>Built tail-driven rod-solver physics with lumen coupling for coaxial catheter/guidewire motion; configured eight instrument profiles without code.</w:t>
       </w:r>
     </w:p>
     <w:p>
@@ -509,7 +509,7 @@
           <w:sz w:val="20"/>
           <w:szCs w:val="20"/>
         </w:rPr>
-        <w:t xml:space="preserve">Modelled treatment as it is performed: the balloon opens the lesion and elastically recoils, while a stent crimped on it expands, implants on deflation and stays fixed to the breathing vessel wall.</w:t>
+        <w:t>Simulated treatment mechanics: balloon dilation with elastic recoil, plus a stent that expands, implants on deflation and stays fixed to the breathing vessel wall.</w:t>
       </w:r>
     </w:p>
     <w:p>
@@ -601,7 +601,7 @@
           <w:sz w:val="22"/>
           <w:szCs w:val="22"/>
         </w:rPr>
-        <w:t>Unity Engineer | Engineering Owner and Co-founder</w:t>
+        <w:t>Real-Time 3D Software Engineer &amp; Co-founder</w:t>
       </w:r>
       <w:r>
         <w:tab/>
@@ -645,7 +645,7 @@
           <w:sz w:val="20"/>
           <w:szCs w:val="20"/>
         </w:rPr>
-        <w:t>Owned Unity engineering for a high-traffic Unity WebGL product reaching 9M+ users at 40k DAU peak, plus nine standalone WebGL titles built on a shared codebase.</w:t>
+        <w:t>Owned C# and real-time 3D engineering for a high-traffic WebGL product reaching 9M+ users at 40k DAU peak, plus nine standalone WebGL titles built on a shared codebase.</w:t>
       </w:r>
     </w:p>
     <w:p>
@@ -669,7 +669,7 @@
           <w:sz w:val="20"/>
           <w:szCs w:val="20"/>
         </w:rPr>
-        <w:t>Built and maintained a shared Unity codebase shipping nine standalone WebGL titles (Find the Brainrots, Plane Builder, Plus-One Jump, Plus-One Run, Slimes, Build Island and others) from per-game feature branches; reusable services, state machine and save layer across all of them.</w:t>
+        <w:t>Shipped nine standalone WebGL titles from a shared C# codebase with reusable services, state machine and save layer across per-game feature branches.</w:t>
       </w:r>
     </w:p>
     <w:p>
@@ -693,7 +693,7 @@
           <w:sz w:val="20"/>
           <w:szCs w:val="20"/>
         </w:rPr>
-        <w:t>Reduced WebGL build size from 100 MB to 20 MB through shader-variant scoping, asset stripping and texture/audio re-encoding; improved low-end Android from ~15 FPS to stable 60 FPS via GC allocation reduction, pooling, batching and profiler-driven optimization; eliminated mobile-browser page reloads using on-demand Resources.Load with explicit UnloadUnusedAssets / GC.Collect between scene transitions.</w:t>
+        <w:t>Reduced WebGL build size from 100 MB to 20 MB through shader and asset scoping plus media re-encoding; improved low-end Android from ~15 FPS to stable 60 FPS through GC reduction, pooling, batching and profiler-driven optimization.</w:t>
       </w:r>
     </w:p>
     <w:p>
@@ -741,7 +741,7 @@
           <w:sz w:val="20"/>
           <w:szCs w:val="20"/>
         </w:rPr>
-        <w:t>Designed a reusable Unity architecture: DI (VContainer / custom service locator), hierarchical state machines, ScriptableObject configuration and a multi-backend save abstraction (PlayerPrefs / Mirra SDK cloud sync) driving reactive UI through R3 ReactiveProperty.</w:t>
+        <w:t>Designed reusable architecture with dependency injection, hierarchical state machines, ScriptableObject configuration, reactive UI and a multi-backend persistence layer.</w:t>
       </w:r>
     </w:p>
     <w:p>
@@ -765,30 +765,6 @@
           <w:sz w:val="20"/>
           <w:szCs w:val="20"/>
         </w:rPr>
-        <w:t>Integrated production monetization stack: AppLovin MAX with 13 mediation adapters, Unity IAP, Google Play Billing and Play Core in-app updates, plus five analytics SDKs (GameAnalytics, AppMetrica, AppsFlyer, ByteBrew, Firebase) behind a single facade.</w:t>
-      </w:r>
-    </w:p>
-    <w:p>
-      <w:pPr>
-        <w:pStyle w:val="ListParagraph"/>
-        <w:numPr>
-          <w:ilvl w:val="0"/>
-          <w:numId w:val="2"/>
-        </w:numPr>
-        <w:spacing w:after="10"/>
-        <w:rPr>
-          <w:rFonts w:ascii="Arial" w:hAnsi="Arial" w:cs="Arial"/>
-          <w:sz w:val="20"/>
-          <w:szCs w:val="20"/>
-        </w:rPr>
-      </w:pPr>
-      <w:r>
-        <w:rPr>
-          <w:rFonts w:ascii="Arial" w:hAnsi="Arial" w:cs="Arial"/>
-          <w:color w:val="1A1A1A"/>
-          <w:sz w:val="20"/>
-          <w:szCs w:val="20"/>
-        </w:rPr>
         <w:t>Optimized environment geometry from ~1M to ~40k triangles on a mobile prototype via mesh decimation, LODs and silhouette-preserving proxies; supported production releases across WebGL and mobile platforms under strict performance, memory and build-size constraints.</w:t>
       </w:r>
     </w:p>
@@ -819,7 +795,7 @@
           <w:sz w:val="20"/>
           <w:szCs w:val="20"/>
         </w:rPr>
-        <w:t>Unity, C#, URP, VContainer, R3, UniTask, Addressables, AppLovin MAX, Mirra SDK, Playgama.</w:t>
+        <w:t xml:space="preserve"> Unity, C#, URP, VContainer, R3, UniTask, Addressables, WebGL, Android.</w:t>
       </w:r>
     </w:p>
     <w:p>
@@ -869,15 +845,15 @@
           <w:sz w:val="20"/>
           <w:szCs w:val="20"/>
         </w:rPr>
-        <w:t>Engine &amp; Languages:</w:t>
-      </w:r>
-      <w:r>
-        <w:rPr>
-          <w:rFonts w:ascii="Arial" w:hAnsi="Arial" w:cs="Arial"/>
-          <w:sz w:val="20"/>
-          <w:szCs w:val="20"/>
-        </w:rPr>
-        <w:t xml:space="preserve"> C#, Unity (URP)</w:t>
+        <w:t>Architecture:</w:t>
+      </w:r>
+      <w:r>
+        <w:rPr>
+          <w:rFonts w:ascii="Arial" w:hAnsi="Arial" w:cs="Arial"/>
+          <w:sz w:val="20"/>
+          <w:szCs w:val="20"/>
+        </w:rPr>
+        <w:t xml:space="preserve"> SOLID, dependency injection (VContainer, custom service locator), hierarchical state machines, ScriptableObject configuration, reactive systems (R3, UniRx, UniTask), multi-backend persistence</w:t>
       </w:r>
     </w:p>
     <w:p>
@@ -901,15 +877,15 @@
           <w:sz w:val="20"/>
           <w:szCs w:val="20"/>
         </w:rPr>
-        <w:t>Architecture:</w:t>
-      </w:r>
-      <w:r>
-        <w:rPr>
-          <w:rFonts w:ascii="Arial" w:hAnsi="Arial" w:cs="Arial"/>
-          <w:sz w:val="20"/>
-          <w:szCs w:val="20"/>
-        </w:rPr>
-        <w:t xml:space="preserve"> SOLID, dependency injection (VContainer, custom service locator), hierarchical state machines, ScriptableObject-driven configuration, reactive event systems (R3, UniRx, UniTask), save-system abstraction with multi-backend implementations</w:t>
+        <w:t>Numerical Simulation:</w:t>
+      </w:r>
+      <w:r>
+        <w:rPr>
+          <w:rFonts w:ascii="Arial" w:hAnsi="Arial" w:cs="Arial"/>
+          <w:sz w:val="20"/>
+          <w:szCs w:val="20"/>
+        </w:rPr>
+        <w:t xml:space="preserve"> advection-diffusion transport, vessel-graph solvers, stenosis and occlusion behaviour, multi-bolus fields, rod and soft-body physics</w:t>
       </w:r>
     </w:p>
     <w:p>
@@ -933,15 +909,15 @@
           <w:sz w:val="20"/>
           <w:szCs w:val="20"/>
         </w:rPr>
-        <w:t>Rendering:</w:t>
-      </w:r>
-      <w:r>
-        <w:rPr>
-          <w:rFonts w:ascii="Arial" w:hAnsi="Arial" w:cs="Arial"/>
-          <w:sz w:val="20"/>
-          <w:szCs w:val="20"/>
-        </w:rPr>
-        <w:t xml:space="preserve"> custom URP render features and passes, image-effect composition, X-ray-style visualization, WebGL shader budgeting, ShaderVariantCollection management, Cinemachine 3, Unity Animation Rigging</w:t>
+        <w:t>Rendering &amp; Medical Imaging:</w:t>
+      </w:r>
+      <w:r>
+        <w:rPr>
+          <w:rFonts w:ascii="Arial" w:hAnsi="Arial" w:cs="Arial"/>
+          <w:sz w:val="20"/>
+          <w:szCs w:val="20"/>
+        </w:rPr>
+        <w:t xml:space="preserve"> custom URP render features, five-pass fluoroscopy, DSA road-mapping, density accumulation, detector gain and lag, CT-volume path</w:t>
       </w:r>
     </w:p>
     <w:p>
@@ -965,15 +941,15 @@
           <w:sz w:val="20"/>
           <w:szCs w:val="20"/>
         </w:rPr>
-        <w:t>Physics &amp; Simulation:</w:t>
-      </w:r>
-      <w:r>
-        <w:rPr>
-          <w:rFonts w:ascii="Arial" w:hAnsi="Arial" w:cs="Arial"/>
-          <w:sz w:val="20"/>
-          <w:szCs w:val="20"/>
-        </w:rPr>
-        <w:t xml:space="preserve"> custom Rigidbody vehicle controller (spring-damper, sphere-cast, drift/boost/air-control), ConfigurableJoints, guidewire/catheter simulation, multi-rigidbody systems, procedural meshes, blendshape-driven deformation</w:t>
+        <w:t>Physics &amp; Real-Time 3D:</w:t>
+      </w:r>
+      <w:r>
+        <w:rPr>
+          <w:rFonts w:ascii="Arial" w:hAnsi="Arial" w:cs="Arial"/>
+          <w:sz w:val="20"/>
+          <w:szCs w:val="20"/>
+        </w:rPr>
+        <w:t xml:space="preserve"> catheter and guidewire lumen coupling, custom Rigidbody vehicle controller, ConfigurableJoints, procedural meshes, skinned deformation</w:t>
       </w:r>
     </w:p>
     <w:p>
@@ -997,71 +973,6 @@
           <w:sz w:val="20"/>
           <w:szCs w:val="20"/>
         </w:rPr>
-        <w:t>Platform SDKs:</w:t>
-      </w:r>
-      <w:r>
-        <w:rPr>
-          <w:rFonts w:ascii="Arial" w:hAnsi="Arial" w:cs="Arial"/>
-          <w:sz w:val="20"/>
-          <w:szCs w:val="20"/>
-        </w:rPr>
-        <w:t xml:space="preserve"> AppLovin MAX (13 mediation adapters), Unity IAP, Google Play Billing &amp; Play Core, Mirra SDK 5, Playgama Bridge (WebGL portals)</w:t>
-      </w:r>
-    </w:p>
-    <w:p>
-      <w:pPr>
-        <w:pStyle w:val="ListParagraph"/>
-        <w:numPr>
-          <w:ilvl w:val="0"/>
-          <w:numId w:val="4"/>
-        </w:numPr>
-        <w:rPr>
-          <w:rFonts w:ascii="Arial" w:hAnsi="Arial" w:cs="Arial"/>
-          <w:sz w:val="20"/>
-          <w:szCs w:val="20"/>
-        </w:rPr>
-      </w:pPr>
-      <w:r>
-        <w:rPr>
-          <w:rFonts w:ascii="Arial" w:hAnsi="Arial" w:cs="Arial"/>
-          <w:b/>
-          <w:bCs/>
-          <w:sz w:val="20"/>
-          <w:szCs w:val="20"/>
-        </w:rPr>
-        <w:t>Analytics:</w:t>
-      </w:r>
-      <w:r>
-        <w:rPr>
-          <w:rFonts w:ascii="Arial" w:hAnsi="Arial" w:cs="Arial"/>
-          <w:sz w:val="20"/>
-          <w:szCs w:val="20"/>
-        </w:rPr>
-        <w:t xml:space="preserve"> GameAnalytics, AppMetrica, AppsFlyer, ByteBrew, Firebase Analytics</w:t>
-      </w:r>
-    </w:p>
-    <w:p>
-      <w:pPr>
-        <w:pStyle w:val="ListParagraph"/>
-        <w:numPr>
-          <w:ilvl w:val="0"/>
-          <w:numId w:val="4"/>
-        </w:numPr>
-        <w:rPr>
-          <w:rFonts w:ascii="Arial" w:hAnsi="Arial" w:cs="Arial"/>
-          <w:sz w:val="20"/>
-          <w:szCs w:val="20"/>
-          <w:lang w:val="en-US"/>
-        </w:rPr>
-      </w:pPr>
-      <w:r>
-        <w:rPr>
-          <w:rFonts w:ascii="Arial" w:hAnsi="Arial" w:cs="Arial"/>
-          <w:b/>
-          <w:bCs/>
-          <w:sz w:val="20"/>
-          <w:szCs w:val="20"/>
-        </w:rPr>
         <w:t>Performance:</w:t>
       </w:r>
       <w:r>
@@ -1070,39 +981,7 @@
           <w:sz w:val="20"/>
           <w:szCs w:val="20"/>
         </w:rPr>
-        <w:t xml:space="preserve"> Unity Profiler, Memory Profiler, GC allocation reduction, draw-call analysis and batching, WebGL build-size optimization, low-end Android profiling</w:t>
-      </w:r>
-    </w:p>
-    <w:p>
-      <w:pPr>
-        <w:pStyle w:val="ListParagraph"/>
-        <w:numPr>
-          <w:ilvl w:val="0"/>
-          <w:numId w:val="4"/>
-        </w:numPr>
-        <w:rPr>
-          <w:rFonts w:ascii="Arial" w:hAnsi="Arial" w:cs="Arial"/>
-          <w:sz w:val="20"/>
-          <w:szCs w:val="20"/>
-        </w:rPr>
-      </w:pPr>
-      <w:r>
-        <w:rPr>
-          <w:rFonts w:ascii="Arial" w:hAnsi="Arial" w:cs="Arial"/>
-          <w:b/>
-          <w:bCs/>
-          <w:sz w:val="20"/>
-          <w:szCs w:val="20"/>
-        </w:rPr>
-        <w:t>Production Tooling:</w:t>
-      </w:r>
-      <w:r>
-        <w:rPr>
-          <w:rFonts w:ascii="Arial" w:hAnsi="Arial" w:cs="Arial"/>
-          <w:sz w:val="20"/>
-          <w:szCs w:val="20"/>
-        </w:rPr>
-        <w:t xml:space="preserve"> Addressables, Unity Localization, custom Editor tools, content pipelines, pre-build validation, Git</w:t>
+        <w:t xml:space="preserve"> Unity Profiler, Memory Profiler, GC reduction, draw-call batching, WebGL build-size optimization, low-end Android profiling</w:t>
       </w:r>
     </w:p>
     <w:p>

</xml_diff>